<commit_message>
Change to occupant for documenting
</commit_message>
<xml_diff>
--- a/DocumentForm/CT01.docx
+++ b/DocumentForm/CT01.docx
@@ -935,6 +935,7 @@
         </w:rPr>
         <w:t>{{</w:t>
       </w:r>
+      <w:proofErr w:type="spellStart"/>
       <w:r>
         <w:rPr>
           <w:rFonts w:ascii="Times New Roman" w:eastAsia="Times New Roman" w:hAnsi="Times New Roman"/>
@@ -942,8 +943,18 @@
           <w:sz w:val="26"/>
           <w:szCs w:val="26"/>
         </w:rPr>
+        <w:t>Tenant</w:t>
+      </w:r>
+      <w:r>
+        <w:rPr>
+          <w:rFonts w:ascii="Times New Roman" w:eastAsia="Times New Roman" w:hAnsi="Times New Roman"/>
+          <w:color w:val="000000"/>
+          <w:sz w:val="26"/>
+          <w:szCs w:val="26"/>
+        </w:rPr>
         <w:t>Sex</w:t>
       </w:r>
+      <w:proofErr w:type="spellEnd"/>
       <w:r>
         <w:rPr>
           <w:rFonts w:ascii="Times New Roman" w:eastAsia="Times New Roman" w:hAnsi="Times New Roman"/>
@@ -993,7 +1004,7 @@
             <w:szCs w:val="24"/>
             <w:lang w:val="pt-BR"/>
           </w:rPr>
-          <w:tag w:val="TenantID"/>
+          <w:tag w:val="TenantNationalIdCardNumber"/>
           <w:id w:val="1678998328"/>
           <w:placeholder>
             <w:docPart w:val="69C72379540142E5B4B2E0A15C08DF03"/>
@@ -1548,17 +1559,7 @@
           <w:szCs w:val="24"/>
           <w:lang w:val="pt-BR"/>
         </w:rPr>
-        <w:t>..</w:t>
-      </w:r>
-      <w:r>
-        <w:rPr>
-          <w:rFonts w:ascii="Times New Roman" w:eastAsia="Times New Roman" w:hAnsi="Times New Roman"/>
-          <w:color w:val="000000"/>
-          <w:sz w:val="24"/>
-          <w:szCs w:val="24"/>
-          <w:lang w:val="pt-BR"/>
-        </w:rPr>
-        <w:t>.</w:t>
+        <w:t xml:space="preserve">                                         </w:t>
       </w:r>
       <w:r>
         <w:rPr>
@@ -1627,16 +1628,6 @@
           <w:szCs w:val="16"/>
         </w:rPr>
         <w:t>}}</w:t>
-      </w:r>
-      <w:r>
-        <w:rPr>
-          <w:rFonts w:ascii="Times New Roman" w:eastAsia="Times New Roman" w:hAnsi="Times New Roman"/>
-          <w:color w:val="000000"/>
-          <w:sz w:val="24"/>
-          <w:szCs w:val="24"/>
-          <w:lang w:val="vi-VN"/>
-        </w:rPr>
-        <w:tab/>
       </w:r>
     </w:p>
     <w:p>
@@ -1718,7 +1709,7 @@
           <w:sz w:val="24"/>
           <w:szCs w:val="24"/>
         </w:rPr>
-        <w:t>…</w:t>
+        <w:t xml:space="preserve">     </w:t>
       </w:r>
       <w:r>
         <w:rPr>
@@ -1757,19 +1748,8 @@
           <w:sz w:val="24"/>
           <w:szCs w:val="14"/>
         </w:rPr>
-        <w:t xml:space="preserve"> </w:t>
-      </w:r>
-      <w:proofErr w:type="spellStart"/>
-      <w:r>
-        <w:rPr>
-          <w:rFonts w:ascii="Times New Roman" w:eastAsia="Times New Roman" w:hAnsi="Times New Roman"/>
-          <w:color w:val="000000"/>
-          <w:sz w:val="24"/>
-          <w:szCs w:val="14"/>
-        </w:rPr>
-        <w:t>thuê</w:t>
-      </w:r>
-      <w:proofErr w:type="spellEnd"/>
+        <w:t xml:space="preserve"> thuê</w:t>
+      </w:r>
     </w:p>
     <w:tbl>
       <w:tblPr>
@@ -1801,7 +1781,7 @@
             <w:szCs w:val="24"/>
             <w:lang w:val="pt-BR"/>
           </w:rPr>
-          <w:tag w:val="LandlordID"/>
+          <w:tag w:val="LandlordNationalIdCardNumber"/>
           <w:id w:val="213011653"/>
           <w:placeholder>
             <w:docPart w:val="C4464C7239DB436787CDA0A4E69DF63B"/>
@@ -9759,8 +9739,11 @@
   <w:rsids>
     <w:rsidRoot w:val="0030558B"/>
     <w:rsid w:val="0007522F"/>
+    <w:rsid w:val="00110171"/>
     <w:rsid w:val="0030558B"/>
+    <w:rsid w:val="00CA4951"/>
     <w:rsid w:val="00E24F31"/>
+    <w:rsid w:val="00F55FCA"/>
   </w:rsids>
   <m:mathPr>
     <m:mathFont m:val="Cambria Math"/>
@@ -10221,22 +10204,6 @@
       <w:color w:val="666666"/>
     </w:rPr>
   </w:style>
-  <w:style w:type="paragraph" w:customStyle="1" w:styleId="60398443768B41E2B00C7FBA0E67A6B2">
-    <w:name w:val="60398443768B41E2B00C7FBA0E67A6B2"/>
-    <w:rsid w:val="0030558B"/>
-  </w:style>
-  <w:style w:type="paragraph" w:customStyle="1" w:styleId="5454D05FCFD541949EDB97F25AE10DD2">
-    <w:name w:val="5454D05FCFD541949EDB97F25AE10DD2"/>
-    <w:rsid w:val="0030558B"/>
-  </w:style>
-  <w:style w:type="paragraph" w:customStyle="1" w:styleId="CF71DA4BE8A640F4AF9D81A7920939F2">
-    <w:name w:val="CF71DA4BE8A640F4AF9D81A7920939F2"/>
-    <w:rsid w:val="0030558B"/>
-  </w:style>
-  <w:style w:type="paragraph" w:customStyle="1" w:styleId="EBEE987FFA2A4029BBE19824DE143F74">
-    <w:name w:val="EBEE987FFA2A4029BBE19824DE143F74"/>
-    <w:rsid w:val="0030558B"/>
-  </w:style>
   <w:style w:type="paragraph" w:customStyle="1" w:styleId="69C72379540142E5B4B2E0A15C08DF03">
     <w:name w:val="69C72379540142E5B4B2E0A15C08DF03"/>
     <w:rsid w:val="0030558B"/>
@@ -10571,6 +10538,15 @@
 </file>
 
 <file path=customXml/item1.xml><?xml version="1.0" encoding="utf-8"?>
+<?mso-contentType ?>
+<FormTemplates xmlns="http://schemas.microsoft.com/sharepoint/v3/contenttype/forms">
+  <Display>DocumentLibraryForm</Display>
+  <Edit>DocumentLibraryForm</Edit>
+  <New>DocumentLibraryForm</New>
+</FormTemplates>
+</file>
+
+<file path=customXml/item2.xml><?xml version="1.0" encoding="utf-8"?>
 <ct:contentTypeSchema xmlns:ct="http://schemas.microsoft.com/office/2006/metadata/contentType" xmlns:ma="http://schemas.microsoft.com/office/2006/metadata/properties/metaAttributes" ct:_="" ma:_="" ma:contentTypeName="Unknown Document Type" ma:contentTypeID="0x010104" ma:contentTypeVersion="0" ma:contentTypeDescription="" ma:contentTypeScope="" ma:versionID="05d83ceaa0bbd2e3bc716e6e66bd857a">
   <xsd:schema xmlns:xsd="http://www.w3.org/2001/XMLSchema" xmlns:xs="http://www.w3.org/2001/XMLSchema" xmlns:p="http://schemas.microsoft.com/office/2006/metadata/properties" targetNamespace="http://schemas.microsoft.com/office/2006/metadata/properties" ma:root="true" ma:fieldsID="b3d69fe45253d5ff147bb69036b756a7">
     <xsd:element name="properties">
@@ -10684,15 +10660,6 @@
 </ct:contentTypeSchema>
 </file>
 
-<file path=customXml/item2.xml><?xml version="1.0" encoding="utf-8"?>
-<?mso-contentType ?>
-<FormTemplates xmlns="http://schemas.microsoft.com/sharepoint/v3/contenttype/forms">
-  <Display>DocumentLibraryForm</Display>
-  <Edit>DocumentLibraryForm</Edit>
-  <New>DocumentLibraryForm</New>
-</FormTemplates>
-</file>
-
 <file path=customXml/item3.xml><?xml version="1.0" encoding="utf-8"?>
 <p:properties xmlns:p="http://schemas.microsoft.com/office/2006/metadata/properties" xmlns:xsi="http://www.w3.org/2001/XMLSchema-instance" xmlns:pc="http://schemas.microsoft.com/office/infopath/2007/PartnerControls">
   <documentManagement/>
@@ -10700,6 +10667,14 @@
 </file>
 
 <file path=customXml/itemProps1.xml><?xml version="1.0" encoding="utf-8"?>
+<ds:datastoreItem xmlns:ds="http://schemas.openxmlformats.org/officeDocument/2006/customXml" ds:itemID="{DF1C0F5B-8A4A-47B4-A2DB-4BEBD756A28D}">
+  <ds:schemaRefs>
+    <ds:schemaRef ds:uri="http://schemas.microsoft.com/sharepoint/v3/contenttype/forms"/>
+  </ds:schemaRefs>
+</ds:datastoreItem>
+</file>
+
+<file path=customXml/itemProps2.xml><?xml version="1.0" encoding="utf-8"?>
 <ds:datastoreItem xmlns:ds="http://schemas.openxmlformats.org/officeDocument/2006/customXml" ds:itemID="{CC3E467C-9E41-4AFA-8E2B-47AE0AFFFDCB}">
   <ds:schemaRefs>
     <ds:schemaRef ds:uri="http://schemas.microsoft.com/office/2006/metadata/contentType"/>
@@ -10715,14 +10690,6 @@
 </ds:datastoreItem>
 </file>
 
-<file path=customXml/itemProps2.xml><?xml version="1.0" encoding="utf-8"?>
-<ds:datastoreItem xmlns:ds="http://schemas.openxmlformats.org/officeDocument/2006/customXml" ds:itemID="{DF1C0F5B-8A4A-47B4-A2DB-4BEBD756A28D}">
-  <ds:schemaRefs>
-    <ds:schemaRef ds:uri="http://schemas.microsoft.com/sharepoint/v3/contenttype/forms"/>
-  </ds:schemaRefs>
-</ds:datastoreItem>
-</file>
-
 <file path=customXml/itemProps3.xml><?xml version="1.0" encoding="utf-8"?>
 <ds:datastoreItem xmlns:ds="http://schemas.openxmlformats.org/officeDocument/2006/customXml" ds:itemID="{69A31FD1-E98A-4960-A215-3E7BFD613630}">
   <ds:schemaRefs>

</xml_diff>

<commit_message>
fix document reporting in document tag and adding DOB in occupants
</commit_message>
<xml_diff>
--- a/DocumentForm/CT01.docx
+++ b/DocumentForm/CT01.docx
@@ -13,7 +13,6 @@
           <w:szCs w:val="26"/>
         </w:rPr>
       </w:pPr>
-      <w:proofErr w:type="spellStart"/>
       <w:r>
         <w:rPr>
           <w:rFonts w:ascii="Times New Roman" w:eastAsia="Times New Roman" w:hAnsi="Times New Roman"/>
@@ -21,93 +20,85 @@
           <w:sz w:val="26"/>
           <w:szCs w:val="26"/>
         </w:rPr>
-        <w:t>Mẫu</w:t>
-      </w:r>
-      <w:proofErr w:type="spellEnd"/>
-      <w:r>
-        <w:rPr>
-          <w:rFonts w:ascii="Times New Roman" w:eastAsia="Times New Roman" w:hAnsi="Times New Roman"/>
+        <w:t>Mẫu CT01 b</w:t>
+      </w:r>
+      <w:r>
+        <w:rPr>
+          <w:rFonts w:ascii="Times New Roman" w:eastAsia="Times New Roman" w:hAnsi="Times New Roman"/>
+          <w:bCs/>
           <w:color w:val="000000"/>
           <w:sz w:val="26"/>
           <w:szCs w:val="26"/>
         </w:rPr>
-        <w:t xml:space="preserve"> CT01 b</w:t>
-      </w:r>
-      <w:r>
-        <w:rPr>
-          <w:rFonts w:ascii="Times New Roman" w:eastAsia="Times New Roman" w:hAnsi="Times New Roman"/>
-          <w:bCs/>
+        <w:t xml:space="preserve">an hành kèm theo </w:t>
+      </w:r>
+      <w:r>
+        <w:rPr>
+          <w:rFonts w:ascii="Times New Roman" w:eastAsia="Times New Roman" w:hAnsi="Times New Roman"/>
           <w:color w:val="000000"/>
           <w:sz w:val="26"/>
           <w:szCs w:val="26"/>
         </w:rPr>
-        <w:t xml:space="preserve">an </w:t>
-      </w:r>
-      <w:proofErr w:type="spellStart"/>
-      <w:r>
-        <w:rPr>
-          <w:rFonts w:ascii="Times New Roman" w:eastAsia="Times New Roman" w:hAnsi="Times New Roman"/>
-          <w:bCs/>
+        <w:t xml:space="preserve">Thông tư số </w:t>
+      </w:r>
+      <w:r>
+        <w:rPr>
+          <w:rFonts w:ascii="Times New Roman" w:eastAsia="Times New Roman" w:hAnsi="Times New Roman"/>
           <w:color w:val="000000"/>
           <w:sz w:val="26"/>
           <w:szCs w:val="26"/>
         </w:rPr>
-        <w:t>hành</w:t>
-      </w:r>
-      <w:proofErr w:type="spellEnd"/>
-      <w:r>
-        <w:rPr>
-          <w:rFonts w:ascii="Times New Roman" w:eastAsia="Times New Roman" w:hAnsi="Times New Roman"/>
-          <w:bCs/>
+        <w:t>53</w:t>
+      </w:r>
+      <w:r>
+        <w:rPr>
+          <w:rFonts w:ascii="Times New Roman" w:eastAsia="Times New Roman" w:hAnsi="Times New Roman"/>
           <w:color w:val="000000"/>
           <w:sz w:val="26"/>
           <w:szCs w:val="26"/>
         </w:rPr>
-        <w:t xml:space="preserve"> </w:t>
-      </w:r>
-      <w:proofErr w:type="spellStart"/>
-      <w:r>
-        <w:rPr>
-          <w:rFonts w:ascii="Times New Roman" w:eastAsia="Times New Roman" w:hAnsi="Times New Roman"/>
+        <w:t>/2025/TT-BCA</w:t>
+      </w:r>
+    </w:p>
+    <w:p>
+      <w:pPr>
+        <w:spacing w:after="0" w:line="240" w:lineRule="auto"/>
+        <w:jc w:val="center"/>
+        <w:rPr>
+          <w:rFonts w:ascii="Times New Roman" w:eastAsia="Times New Roman" w:hAnsi="Times New Roman"/>
+          <w:b/>
           <w:bCs/>
           <w:color w:val="000000"/>
           <w:sz w:val="26"/>
           <w:szCs w:val="26"/>
         </w:rPr>
-        <w:t>kèm</w:t>
-      </w:r>
-      <w:proofErr w:type="spellEnd"/>
-      <w:r>
-        <w:rPr>
-          <w:rFonts w:ascii="Times New Roman" w:eastAsia="Times New Roman" w:hAnsi="Times New Roman"/>
-          <w:bCs/>
+      </w:pPr>
+      <w:r>
+        <w:rPr>
+          <w:rFonts w:ascii="Times New Roman" w:eastAsia="Times New Roman" w:hAnsi="Times New Roman"/>
           <w:color w:val="000000"/>
           <w:sz w:val="26"/>
           <w:szCs w:val="26"/>
         </w:rPr>
-        <w:t xml:space="preserve"> </w:t>
-      </w:r>
-      <w:proofErr w:type="spellStart"/>
-      <w:r>
-        <w:rPr>
-          <w:rFonts w:ascii="Times New Roman" w:eastAsia="Times New Roman" w:hAnsi="Times New Roman"/>
-          <w:bCs/>
+        <w:t xml:space="preserve"> ngày 01</w:t>
+      </w:r>
+      <w:r>
+        <w:rPr>
+          <w:rFonts w:ascii="Times New Roman" w:eastAsia="Times New Roman" w:hAnsi="Times New Roman"/>
           <w:color w:val="000000"/>
           <w:sz w:val="26"/>
           <w:szCs w:val="26"/>
         </w:rPr>
-        <w:t>theo</w:t>
-      </w:r>
-      <w:proofErr w:type="spellEnd"/>
-      <w:r>
-        <w:rPr>
-          <w:rFonts w:ascii="Times New Roman" w:eastAsia="Times New Roman" w:hAnsi="Times New Roman"/>
-          <w:bCs/>
+        <w:t>/</w:t>
+      </w:r>
+      <w:r>
+        <w:rPr>
+          <w:rFonts w:ascii="Times New Roman" w:eastAsia="Times New Roman" w:hAnsi="Times New Roman"/>
           <w:color w:val="000000"/>
           <w:sz w:val="26"/>
           <w:szCs w:val="26"/>
         </w:rPr>
-        <w:t xml:space="preserve"> </w:t>
+        <w:t>7/</w:t>
       </w:r>
       <w:r>
         <w:rPr>
@@ -116,215 +107,7 @@
           <w:sz w:val="26"/>
           <w:szCs w:val="26"/>
         </w:rPr>
-        <w:t xml:space="preserve">Thông </w:t>
-      </w:r>
-      <w:proofErr w:type="spellStart"/>
-      <w:r>
-        <w:rPr>
-          <w:rFonts w:ascii="Times New Roman" w:eastAsia="Times New Roman" w:hAnsi="Times New Roman"/>
-          <w:color w:val="000000"/>
-          <w:sz w:val="26"/>
-          <w:szCs w:val="26"/>
-        </w:rPr>
-        <w:t>tư</w:t>
-      </w:r>
-      <w:proofErr w:type="spellEnd"/>
-      <w:r>
-        <w:rPr>
-          <w:rFonts w:ascii="Times New Roman" w:eastAsia="Times New Roman" w:hAnsi="Times New Roman"/>
-          <w:color w:val="000000"/>
-          <w:sz w:val="26"/>
-          <w:szCs w:val="26"/>
-        </w:rPr>
-        <w:t xml:space="preserve"> </w:t>
-      </w:r>
-      <w:proofErr w:type="spellStart"/>
-      <w:r>
-        <w:rPr>
-          <w:rFonts w:ascii="Times New Roman" w:eastAsia="Times New Roman" w:hAnsi="Times New Roman"/>
-          <w:color w:val="000000"/>
-          <w:sz w:val="26"/>
-          <w:szCs w:val="26"/>
-        </w:rPr>
-        <w:t>số</w:t>
-      </w:r>
-      <w:proofErr w:type="spellEnd"/>
-      <w:r>
-        <w:rPr>
-          <w:rFonts w:ascii="Times New Roman" w:eastAsia="Times New Roman" w:hAnsi="Times New Roman"/>
-          <w:color w:val="000000"/>
-          <w:sz w:val="26"/>
-          <w:szCs w:val="26"/>
-        </w:rPr>
-        <w:t xml:space="preserve"> </w:t>
-      </w:r>
-      <w:r>
-        <w:rPr>
-          <w:rFonts w:ascii="Times New Roman" w:eastAsia="Times New Roman" w:hAnsi="Times New Roman"/>
-          <w:color w:val="000000"/>
-          <w:sz w:val="26"/>
-          <w:szCs w:val="26"/>
-        </w:rPr>
-        <w:t>53</w:t>
-      </w:r>
-      <w:r>
-        <w:rPr>
-          <w:rFonts w:ascii="Times New Roman" w:eastAsia="Times New Roman" w:hAnsi="Times New Roman"/>
-          <w:color w:val="000000"/>
-          <w:sz w:val="26"/>
-          <w:szCs w:val="26"/>
-        </w:rPr>
-        <w:t>/2025/TT-BCA</w:t>
-      </w:r>
-    </w:p>
-    <w:p>
-      <w:pPr>
-        <w:spacing w:after="0" w:line="240" w:lineRule="auto"/>
-        <w:jc w:val="center"/>
-        <w:rPr>
-          <w:rFonts w:ascii="Times New Roman" w:eastAsia="Times New Roman" w:hAnsi="Times New Roman"/>
-          <w:b/>
-          <w:bCs/>
-          <w:color w:val="000000"/>
-          <w:sz w:val="26"/>
-          <w:szCs w:val="26"/>
-        </w:rPr>
-      </w:pPr>
-      <w:r>
-        <w:rPr>
-          <w:rFonts w:ascii="Times New Roman" w:eastAsia="Times New Roman" w:hAnsi="Times New Roman"/>
-          <w:color w:val="000000"/>
-          <w:sz w:val="26"/>
-          <w:szCs w:val="26"/>
-        </w:rPr>
-        <w:t xml:space="preserve"> </w:t>
-      </w:r>
-      <w:proofErr w:type="spellStart"/>
-      <w:r>
-        <w:rPr>
-          <w:rFonts w:ascii="Times New Roman" w:eastAsia="Times New Roman" w:hAnsi="Times New Roman"/>
-          <w:color w:val="000000"/>
-          <w:sz w:val="26"/>
-          <w:szCs w:val="26"/>
-        </w:rPr>
-        <w:t>ngày</w:t>
-      </w:r>
-      <w:proofErr w:type="spellEnd"/>
-      <w:r>
-        <w:rPr>
-          <w:rFonts w:ascii="Times New Roman" w:eastAsia="Times New Roman" w:hAnsi="Times New Roman"/>
-          <w:color w:val="000000"/>
-          <w:sz w:val="26"/>
-          <w:szCs w:val="26"/>
-        </w:rPr>
-        <w:t xml:space="preserve"> 01</w:t>
-      </w:r>
-      <w:r>
-        <w:rPr>
-          <w:rFonts w:ascii="Times New Roman" w:eastAsia="Times New Roman" w:hAnsi="Times New Roman"/>
-          <w:color w:val="000000"/>
-          <w:sz w:val="26"/>
-          <w:szCs w:val="26"/>
-        </w:rPr>
-        <w:t>/</w:t>
-      </w:r>
-      <w:r>
-        <w:rPr>
-          <w:rFonts w:ascii="Times New Roman" w:eastAsia="Times New Roman" w:hAnsi="Times New Roman"/>
-          <w:color w:val="000000"/>
-          <w:sz w:val="26"/>
-          <w:szCs w:val="26"/>
-        </w:rPr>
-        <w:t>7/</w:t>
-      </w:r>
-      <w:r>
-        <w:rPr>
-          <w:rFonts w:ascii="Times New Roman" w:eastAsia="Times New Roman" w:hAnsi="Times New Roman"/>
-          <w:color w:val="000000"/>
-          <w:sz w:val="26"/>
-          <w:szCs w:val="26"/>
-        </w:rPr>
-        <w:t xml:space="preserve">2025 </w:t>
-      </w:r>
-      <w:proofErr w:type="spellStart"/>
-      <w:r>
-        <w:rPr>
-          <w:rFonts w:ascii="Times New Roman" w:eastAsia="Times New Roman" w:hAnsi="Times New Roman"/>
-          <w:color w:val="000000"/>
-          <w:sz w:val="26"/>
-          <w:szCs w:val="26"/>
-        </w:rPr>
-        <w:t>của</w:t>
-      </w:r>
-      <w:proofErr w:type="spellEnd"/>
-      <w:r>
-        <w:rPr>
-          <w:rFonts w:ascii="Times New Roman" w:eastAsia="Times New Roman" w:hAnsi="Times New Roman"/>
-          <w:color w:val="000000"/>
-          <w:sz w:val="26"/>
-          <w:szCs w:val="26"/>
-        </w:rPr>
-        <w:t xml:space="preserve"> </w:t>
-      </w:r>
-      <w:proofErr w:type="spellStart"/>
-      <w:r>
-        <w:rPr>
-          <w:rFonts w:ascii="Times New Roman" w:eastAsia="Times New Roman" w:hAnsi="Times New Roman"/>
-          <w:color w:val="000000"/>
-          <w:sz w:val="26"/>
-          <w:szCs w:val="26"/>
-        </w:rPr>
-        <w:t>Bộ</w:t>
-      </w:r>
-      <w:proofErr w:type="spellEnd"/>
-      <w:r>
-        <w:rPr>
-          <w:rFonts w:ascii="Times New Roman" w:eastAsia="Times New Roman" w:hAnsi="Times New Roman"/>
-          <w:color w:val="000000"/>
-          <w:sz w:val="26"/>
-          <w:szCs w:val="26"/>
-        </w:rPr>
-        <w:t xml:space="preserve"> </w:t>
-      </w:r>
-      <w:proofErr w:type="spellStart"/>
-      <w:r>
-        <w:rPr>
-          <w:rFonts w:ascii="Times New Roman" w:eastAsia="Times New Roman" w:hAnsi="Times New Roman"/>
-          <w:color w:val="000000"/>
-          <w:sz w:val="26"/>
-          <w:szCs w:val="26"/>
-        </w:rPr>
-        <w:t>trưởng</w:t>
-      </w:r>
-      <w:proofErr w:type="spellEnd"/>
-      <w:r>
-        <w:rPr>
-          <w:rFonts w:ascii="Times New Roman" w:eastAsia="Times New Roman" w:hAnsi="Times New Roman"/>
-          <w:color w:val="000000"/>
-          <w:sz w:val="26"/>
-          <w:szCs w:val="26"/>
-        </w:rPr>
-        <w:t xml:space="preserve"> </w:t>
-      </w:r>
-      <w:proofErr w:type="spellStart"/>
-      <w:r>
-        <w:rPr>
-          <w:rFonts w:ascii="Times New Roman" w:eastAsia="Times New Roman" w:hAnsi="Times New Roman"/>
-          <w:color w:val="000000"/>
-          <w:sz w:val="26"/>
-          <w:szCs w:val="26"/>
-        </w:rPr>
-        <w:t>Bộ</w:t>
-      </w:r>
-      <w:proofErr w:type="spellEnd"/>
-      <w:r>
-        <w:rPr>
-          <w:rFonts w:ascii="Times New Roman" w:eastAsia="Times New Roman" w:hAnsi="Times New Roman"/>
-          <w:color w:val="000000"/>
-          <w:sz w:val="26"/>
-          <w:szCs w:val="26"/>
-        </w:rPr>
-        <w:t xml:space="preserve"> Công an</w:t>
+        <w:t>2025 của Bộ trưởng Bộ Công an</w:t>
       </w:r>
     </w:p>
     <w:p>
@@ -393,93 +176,8 @@
           <w:sz w:val="28"/>
           <w:szCs w:val="28"/>
         </w:rPr>
-        <w:t xml:space="preserve">Độc </w:t>
-      </w:r>
-      <w:proofErr w:type="spellStart"/>
-      <w:r>
-        <w:rPr>
-          <w:rFonts w:ascii="Times New Roman" w:eastAsia="Times New Roman" w:hAnsi="Times New Roman"/>
-          <w:b/>
-          <w:color w:val="000000"/>
-          <w:spacing w:val="-6"/>
-          <w:sz w:val="28"/>
-          <w:szCs w:val="28"/>
-        </w:rPr>
-        <w:t>lập</w:t>
-      </w:r>
-      <w:proofErr w:type="spellEnd"/>
-      <w:r>
-        <w:rPr>
-          <w:rFonts w:ascii="Times New Roman" w:eastAsia="Times New Roman" w:hAnsi="Times New Roman"/>
-          <w:b/>
-          <w:color w:val="000000"/>
-          <w:spacing w:val="-6"/>
-          <w:sz w:val="28"/>
-          <w:szCs w:val="28"/>
-        </w:rPr>
-        <w:t xml:space="preserve"> – </w:t>
-      </w:r>
-      <w:proofErr w:type="spellStart"/>
-      <w:r>
-        <w:rPr>
-          <w:rFonts w:ascii="Times New Roman" w:eastAsia="Times New Roman" w:hAnsi="Times New Roman"/>
-          <w:b/>
-          <w:color w:val="000000"/>
-          <w:spacing w:val="-6"/>
-          <w:sz w:val="28"/>
-          <w:szCs w:val="28"/>
-        </w:rPr>
-        <w:t>Tự</w:t>
-      </w:r>
-      <w:proofErr w:type="spellEnd"/>
-      <w:r>
-        <w:rPr>
-          <w:rFonts w:ascii="Times New Roman" w:eastAsia="Times New Roman" w:hAnsi="Times New Roman"/>
-          <w:b/>
-          <w:color w:val="000000"/>
-          <w:spacing w:val="-6"/>
-          <w:sz w:val="28"/>
-          <w:szCs w:val="28"/>
-        </w:rPr>
-        <w:t xml:space="preserve"> do – </w:t>
-      </w:r>
-      <w:proofErr w:type="spellStart"/>
-      <w:r>
-        <w:rPr>
-          <w:rFonts w:ascii="Times New Roman" w:eastAsia="Times New Roman" w:hAnsi="Times New Roman"/>
-          <w:b/>
-          <w:color w:val="000000"/>
-          <w:spacing w:val="-6"/>
-          <w:sz w:val="28"/>
-          <w:szCs w:val="28"/>
-        </w:rPr>
-        <w:t>Hạnh</w:t>
-      </w:r>
-      <w:proofErr w:type="spellEnd"/>
-      <w:r>
-        <w:rPr>
-          <w:rFonts w:ascii="Times New Roman" w:eastAsia="Times New Roman" w:hAnsi="Times New Roman"/>
-          <w:b/>
-          <w:color w:val="000000"/>
-          <w:spacing w:val="-6"/>
-          <w:sz w:val="28"/>
-          <w:szCs w:val="28"/>
-        </w:rPr>
-        <w:t xml:space="preserve"> </w:t>
-      </w:r>
-      <w:proofErr w:type="spellStart"/>
-      <w:r>
-        <w:rPr>
-          <w:rFonts w:ascii="Times New Roman" w:eastAsia="Times New Roman" w:hAnsi="Times New Roman"/>
-          <w:b/>
-          <w:color w:val="000000"/>
-          <w:spacing w:val="-6"/>
-          <w:sz w:val="28"/>
-          <w:szCs w:val="28"/>
-        </w:rPr>
-        <w:t>phúc</w:t>
-      </w:r>
-      <w:proofErr w:type="spellEnd"/>
+        <w:t>Độc lập – Tự do – Hạnh phúc</w:t>
+      </w:r>
     </w:p>
     <w:p>
       <w:pPr>
@@ -596,7 +294,6 @@
           <w:szCs w:val="26"/>
         </w:rPr>
       </w:pPr>
-      <w:proofErr w:type="spellStart"/>
       <w:r>
         <w:rPr>
           <w:rFonts w:ascii="Times New Roman" w:eastAsia="Times New Roman" w:hAnsi="Times New Roman"/>
@@ -605,29 +302,7 @@
           <w:sz w:val="26"/>
           <w:szCs w:val="26"/>
         </w:rPr>
-        <w:t>Kính</w:t>
-      </w:r>
-      <w:proofErr w:type="spellEnd"/>
-      <w:r>
-        <w:rPr>
-          <w:rFonts w:ascii="Times New Roman" w:eastAsia="Times New Roman" w:hAnsi="Times New Roman"/>
-          <w:color w:val="000000"/>
-          <w:spacing w:val="-8"/>
-          <w:sz w:val="26"/>
-          <w:szCs w:val="26"/>
-        </w:rPr>
-        <w:t xml:space="preserve"> </w:t>
-      </w:r>
-      <w:proofErr w:type="gramStart"/>
-      <w:r>
-        <w:rPr>
-          <w:rFonts w:ascii="Times New Roman" w:eastAsia="Times New Roman" w:hAnsi="Times New Roman"/>
-          <w:color w:val="000000"/>
-          <w:spacing w:val="-8"/>
-          <w:sz w:val="26"/>
-          <w:szCs w:val="26"/>
-        </w:rPr>
-        <w:t>gửi</w:t>
+        <w:t>Kính gửi</w:t>
       </w:r>
       <w:r>
         <w:rPr>
@@ -638,9 +313,8 @@
           <w:szCs w:val="26"/>
           <w:vertAlign w:val="superscript"/>
         </w:rPr>
-        <w:t>(</w:t>
-      </w:r>
-      <w:proofErr w:type="gramEnd"/>
+        <w:t>(1)</w:t>
+      </w:r>
       <w:r>
         <w:rPr>
           <w:rFonts w:ascii="Times New Roman" w:eastAsia="Times New Roman" w:hAnsi="Times New Roman"/>
@@ -648,42 +322,18 @@
           <w:spacing w:val="-8"/>
           <w:sz w:val="26"/>
           <w:szCs w:val="26"/>
-          <w:vertAlign w:val="superscript"/>
-        </w:rPr>
-        <w:t>1</w:t>
-      </w:r>
-      <w:proofErr w:type="gramStart"/>
-      <w:r>
-        <w:rPr>
-          <w:rFonts w:ascii="Times New Roman" w:eastAsia="Times New Roman" w:hAnsi="Times New Roman"/>
-          <w:color w:val="000000"/>
-          <w:spacing w:val="-8"/>
+        </w:rPr>
+        <w:t>:</w:t>
+      </w:r>
+      <w:r>
+        <w:rPr>
+          <w:rFonts w:ascii="Times New Roman" w:eastAsia="Times New Roman" w:hAnsi="Times New Roman"/>
+          <w:color w:val="000000"/>
           <w:sz w:val="26"/>
           <w:szCs w:val="26"/>
-          <w:vertAlign w:val="superscript"/>
-        </w:rPr>
-        <w:t>)</w:t>
-      </w:r>
-      <w:r>
-        <w:rPr>
-          <w:rFonts w:ascii="Times New Roman" w:eastAsia="Times New Roman" w:hAnsi="Times New Roman"/>
-          <w:color w:val="000000"/>
-          <w:spacing w:val="-8"/>
-          <w:sz w:val="26"/>
-          <w:szCs w:val="26"/>
-        </w:rPr>
-        <w:t>:</w:t>
-      </w:r>
-      <w:r>
-        <w:rPr>
-          <w:rFonts w:ascii="Times New Roman" w:eastAsia="Times New Roman" w:hAnsi="Times New Roman"/>
-          <w:color w:val="000000"/>
-          <w:sz w:val="26"/>
-          <w:szCs w:val="26"/>
         </w:rPr>
         <w:t>......................................................................................................</w:t>
       </w:r>
-      <w:proofErr w:type="gramEnd"/>
     </w:p>
     <w:p>
       <w:pPr>
@@ -718,89 +368,35 @@
           <w:sz w:val="26"/>
           <w:szCs w:val="26"/>
         </w:rPr>
-        <w:t xml:space="preserve"> </w:t>
-      </w:r>
-      <w:proofErr w:type="spellStart"/>
-      <w:r>
-        <w:rPr>
-          <w:rFonts w:ascii="Times New Roman" w:eastAsia="Times New Roman" w:hAnsi="Times New Roman"/>
-          <w:color w:val="000000"/>
-          <w:spacing w:val="-8"/>
+        <w:t xml:space="preserve"> khai sinh</w:t>
+      </w:r>
+      <w:r>
+        <w:rPr>
+          <w:rFonts w:ascii="Times New Roman" w:eastAsia="Times New Roman" w:hAnsi="Times New Roman"/>
+          <w:color w:val="000000"/>
+          <w:sz w:val="24"/>
+          <w:szCs w:val="26"/>
+          <w:lang w:val="vi-VN"/>
+        </w:rPr>
+        <w:t>:</w:t>
+      </w:r>
+      <w:r>
+        <w:rPr>
+          <w:rFonts w:ascii="Times New Roman" w:eastAsia="Times New Roman" w:hAnsi="Times New Roman"/>
+          <w:color w:val="000000"/>
           <w:sz w:val="26"/>
           <w:szCs w:val="26"/>
         </w:rPr>
-        <w:t>khai</w:t>
-      </w:r>
-      <w:proofErr w:type="spellEnd"/>
-      <w:r>
-        <w:rPr>
-          <w:rFonts w:ascii="Times New Roman" w:eastAsia="Times New Roman" w:hAnsi="Times New Roman"/>
-          <w:color w:val="000000"/>
-          <w:spacing w:val="-8"/>
+        <w:t xml:space="preserve"> </w:t>
+      </w:r>
+      <w:r>
+        <w:rPr>
+          <w:rFonts w:ascii="Times New Roman" w:eastAsia="Times New Roman" w:hAnsi="Times New Roman"/>
+          <w:color w:val="000000"/>
           <w:sz w:val="26"/>
           <w:szCs w:val="26"/>
         </w:rPr>
-        <w:t xml:space="preserve"> </w:t>
-      </w:r>
-      <w:proofErr w:type="spellStart"/>
-      <w:r>
-        <w:rPr>
-          <w:rFonts w:ascii="Times New Roman" w:eastAsia="Times New Roman" w:hAnsi="Times New Roman"/>
-          <w:color w:val="000000"/>
-          <w:spacing w:val="-8"/>
-          <w:sz w:val="26"/>
-          <w:szCs w:val="26"/>
-        </w:rPr>
-        <w:t>sinh</w:t>
-      </w:r>
-      <w:proofErr w:type="spellEnd"/>
-      <w:r>
-        <w:rPr>
-          <w:rFonts w:ascii="Times New Roman" w:eastAsia="Times New Roman" w:hAnsi="Times New Roman"/>
-          <w:color w:val="000000"/>
-          <w:sz w:val="24"/>
-          <w:szCs w:val="26"/>
-          <w:lang w:val="vi-VN"/>
-        </w:rPr>
-        <w:t>:</w:t>
-      </w:r>
-      <w:r>
-        <w:rPr>
-          <w:rFonts w:ascii="Times New Roman" w:eastAsia="Times New Roman" w:hAnsi="Times New Roman"/>
-          <w:color w:val="000000"/>
-          <w:sz w:val="26"/>
-          <w:szCs w:val="26"/>
-        </w:rPr>
-        <w:t xml:space="preserve"> </w:t>
-      </w:r>
-      <w:r>
-        <w:rPr>
-          <w:rFonts w:ascii="Times New Roman" w:eastAsia="Times New Roman" w:hAnsi="Times New Roman"/>
-          <w:color w:val="000000"/>
-          <w:sz w:val="26"/>
-          <w:szCs w:val="26"/>
-        </w:rPr>
-        <w:t>{{</w:t>
-      </w:r>
-      <w:proofErr w:type="spellStart"/>
-      <w:r>
-        <w:rPr>
-          <w:rFonts w:ascii="Times New Roman" w:eastAsia="Times New Roman" w:hAnsi="Times New Roman"/>
-          <w:color w:val="000000"/>
-          <w:sz w:val="26"/>
-          <w:szCs w:val="26"/>
-        </w:rPr>
-        <w:t>TenantFullName</w:t>
-      </w:r>
-      <w:proofErr w:type="spellEnd"/>
-      <w:r>
-        <w:rPr>
-          <w:rFonts w:ascii="Times New Roman" w:eastAsia="Times New Roman" w:hAnsi="Times New Roman"/>
-          <w:color w:val="000000"/>
-          <w:sz w:val="26"/>
-          <w:szCs w:val="26"/>
-        </w:rPr>
-        <w:t>}}</w:t>
+        <w:t>{{TenantFullName}}</w:t>
       </w:r>
     </w:p>
     <w:p>
@@ -812,8 +408,8 @@
         <w:rPr>
           <w:rFonts w:ascii="Times New Roman" w:eastAsia="Times New Roman" w:hAnsi="Times New Roman"/>
           <w:color w:val="000000"/>
-          <w:sz w:val="24"/>
-          <w:szCs w:val="24"/>
+          <w:sz w:val="26"/>
+          <w:szCs w:val="26"/>
         </w:rPr>
       </w:pPr>
       <w:r>
@@ -844,9 +440,8 @@
           <w:sz w:val="26"/>
           <w:szCs w:val="26"/>
         </w:rPr>
-        <w:t>{{</w:t>
-      </w:r>
-      <w:proofErr w:type="spellStart"/>
+        <w:t>{{TenantDateOfBirth}}</w:t>
+      </w:r>
       <w:r>
         <w:rPr>
           <w:rFonts w:ascii="Times New Roman" w:eastAsia="Times New Roman" w:hAnsi="Times New Roman"/>
@@ -854,45 +449,7 @@
           <w:sz w:val="26"/>
           <w:szCs w:val="26"/>
         </w:rPr>
-        <w:t>Tenant</w:t>
-      </w:r>
-      <w:r>
-        <w:rPr>
-          <w:rFonts w:ascii="Times New Roman" w:eastAsia="Times New Roman" w:hAnsi="Times New Roman"/>
-          <w:color w:val="000000"/>
-          <w:sz w:val="26"/>
-          <w:szCs w:val="26"/>
-        </w:rPr>
-        <w:t>DOB</w:t>
-      </w:r>
-      <w:proofErr w:type="spellEnd"/>
-      <w:r>
-        <w:rPr>
-          <w:rFonts w:ascii="Times New Roman" w:eastAsia="Times New Roman" w:hAnsi="Times New Roman"/>
-          <w:color w:val="000000"/>
-          <w:sz w:val="26"/>
-          <w:szCs w:val="26"/>
-        </w:rPr>
-        <w:t>}}</w:t>
-      </w:r>
-      <w:r>
-        <w:rPr>
-          <w:rFonts w:ascii="Times New Roman" w:eastAsia="Times New Roman" w:hAnsi="Times New Roman"/>
-          <w:color w:val="000000"/>
-          <w:sz w:val="24"/>
-          <w:szCs w:val="24"/>
-          <w:lang w:val="vi-VN"/>
-        </w:rPr>
-        <w:t xml:space="preserve">      </w:t>
-      </w:r>
-      <w:r>
-        <w:rPr>
-          <w:rFonts w:ascii="Times New Roman" w:eastAsia="Times New Roman" w:hAnsi="Times New Roman"/>
-          <w:color w:val="000000"/>
-          <w:sz w:val="24"/>
-          <w:szCs w:val="24"/>
-        </w:rPr>
-        <w:t xml:space="preserve">         </w:t>
+        <w:t xml:space="preserve">                        </w:t>
       </w:r>
       <w:r>
         <w:rPr>
@@ -935,7 +492,6 @@
         </w:rPr>
         <w:t>{{</w:t>
       </w:r>
-      <w:proofErr w:type="spellStart"/>
       <w:r>
         <w:rPr>
           <w:rFonts w:ascii="Times New Roman" w:eastAsia="Times New Roman" w:hAnsi="Times New Roman"/>
@@ -954,7 +510,6 @@
         </w:rPr>
         <w:t>Sex</w:t>
       </w:r>
-      <w:proofErr w:type="spellEnd"/>
       <w:r>
         <w:rPr>
           <w:rFonts w:ascii="Times New Roman" w:eastAsia="Times New Roman" w:hAnsi="Times New Roman"/>
@@ -977,13 +532,12 @@
     <w:tbl>
       <w:tblPr>
         <w:tblpPr w:leftFromText="180" w:rightFromText="180" w:vertAnchor="text" w:horzAnchor="page" w:tblpX="5261" w:tblpY="-25"/>
-        <w:tblW w:w="5709" w:type="dxa"/>
+        <w:tblW w:w="5270" w:type="dxa"/>
         <w:tblLook w:val="04A0" w:firstRow="1" w:lastRow="0" w:firstColumn="1" w:lastColumn="0" w:noHBand="0" w:noVBand="1"/>
       </w:tblPr>
       <w:tblGrid>
         <w:gridCol w:w="440"/>
         <w:gridCol w:w="440"/>
-        <w:gridCol w:w="439"/>
         <w:gridCol w:w="439"/>
         <w:gridCol w:w="439"/>
         <w:gridCol w:w="439"/>
@@ -1004,10 +558,10 @@
             <w:szCs w:val="24"/>
             <w:lang w:val="pt-BR"/>
           </w:rPr>
-          <w:tag w:val="TenantNationalIdCardNumber"/>
+          <w:tag w:val="Table_PartA"/>
           <w:id w:val="1678998328"/>
           <w:placeholder>
-            <w:docPart w:val="69C72379540142E5B4B2E0A15C08DF03"/>
+            <w:docPart w:val="548483FE28C94D9AB9078CBD2189CEEB"/>
           </w:placeholder>
         </w:sdtPr>
         <w:sdtContent>
@@ -1327,32 +881,6 @@
                 </w:pPr>
               </w:p>
             </w:tc>
-            <w:tc>
-              <w:tcPr>
-                <w:tcW w:w="439" w:type="dxa"/>
-                <w:tcBorders>
-                  <w:top w:val="single" w:sz="4" w:space="0" w:color="auto"/>
-                  <w:left w:val="single" w:sz="4" w:space="0" w:color="auto"/>
-                  <w:bottom w:val="single" w:sz="4" w:space="0" w:color="auto"/>
-                  <w:right w:val="single" w:sz="4" w:space="0" w:color="auto"/>
-                </w:tcBorders>
-              </w:tcPr>
-              <w:p>
-                <w:pPr>
-                  <w:tabs>
-                    <w:tab w:val="left" w:leader="dot" w:pos="10206"/>
-                  </w:tabs>
-                  <w:spacing w:before="100" w:after="100" w:line="240" w:lineRule="auto"/>
-                  <w:rPr>
-                    <w:rFonts w:ascii="Times New Roman" w:eastAsia="Times New Roman" w:hAnsi="Times New Roman"/>
-                    <w:color w:val="000000"/>
-                    <w:sz w:val="24"/>
-                    <w:szCs w:val="24"/>
-                    <w:lang w:val="pt-BR"/>
-                  </w:rPr>
-                </w:pPr>
-              </w:p>
-            </w:tc>
           </w:tr>
         </w:sdtContent>
       </w:sdt>
@@ -1529,27 +1057,7 @@
           <w:sz w:val="24"/>
           <w:szCs w:val="16"/>
         </w:rPr>
-        <w:t>{{</w:t>
-      </w:r>
-      <w:proofErr w:type="spellStart"/>
-      <w:r>
-        <w:rPr>
-          <w:rFonts w:ascii="Times New Roman" w:eastAsia="Times New Roman" w:hAnsi="Times New Roman"/>
-          <w:color w:val="000000"/>
-          <w:sz w:val="24"/>
-          <w:szCs w:val="16"/>
-        </w:rPr>
-        <w:t>TenantPhone</w:t>
-      </w:r>
-      <w:proofErr w:type="spellEnd"/>
-      <w:r>
-        <w:rPr>
-          <w:rFonts w:ascii="Times New Roman" w:eastAsia="Times New Roman" w:hAnsi="Times New Roman"/>
-          <w:color w:val="000000"/>
-          <w:sz w:val="24"/>
-          <w:szCs w:val="16"/>
-        </w:rPr>
-        <w:t>}}</w:t>
+        <w:t>{{TenantPhone}}</w:t>
       </w:r>
       <w:r>
         <w:rPr>
@@ -1607,27 +1115,7 @@
           <w:sz w:val="24"/>
           <w:szCs w:val="16"/>
         </w:rPr>
-        <w:t>{{</w:t>
-      </w:r>
-      <w:proofErr w:type="spellStart"/>
-      <w:r>
-        <w:rPr>
-          <w:rFonts w:ascii="Times New Roman" w:eastAsia="Times New Roman" w:hAnsi="Times New Roman"/>
-          <w:color w:val="000000"/>
-          <w:sz w:val="24"/>
-          <w:szCs w:val="16"/>
-        </w:rPr>
-        <w:t>TenantEmail</w:t>
-      </w:r>
-      <w:proofErr w:type="spellEnd"/>
-      <w:r>
-        <w:rPr>
-          <w:rFonts w:ascii="Times New Roman" w:eastAsia="Times New Roman" w:hAnsi="Times New Roman"/>
-          <w:color w:val="000000"/>
-          <w:sz w:val="24"/>
-          <w:szCs w:val="16"/>
-        </w:rPr>
-        <w:t>}}</w:t>
+        <w:t>{{TenantEmail}}</w:t>
       </w:r>
     </w:p>
     <w:p>
@@ -1680,9 +1168,8 @@
           <w:sz w:val="24"/>
           <w:szCs w:val="24"/>
         </w:rPr>
-        <w:t>{{</w:t>
-      </w:r>
-      <w:proofErr w:type="spellStart"/>
+        <w:t>{{LandlordName}}</w:t>
+      </w:r>
       <w:r>
         <w:rPr>
           <w:rFonts w:ascii="Times New Roman" w:eastAsia="Times New Roman" w:hAnsi="Times New Roman"/>
@@ -1690,25 +1177,6 @@
           <w:sz w:val="24"/>
           <w:szCs w:val="24"/>
         </w:rPr>
-        <w:t>LandlordName</w:t>
-      </w:r>
-      <w:proofErr w:type="spellEnd"/>
-      <w:r>
-        <w:rPr>
-          <w:rFonts w:ascii="Times New Roman" w:eastAsia="Times New Roman" w:hAnsi="Times New Roman"/>
-          <w:color w:val="000000"/>
-          <w:sz w:val="24"/>
-          <w:szCs w:val="24"/>
-        </w:rPr>
-        <w:t>}}</w:t>
-      </w:r>
-      <w:r>
-        <w:rPr>
-          <w:rFonts w:ascii="Times New Roman" w:eastAsia="Times New Roman" w:hAnsi="Times New Roman"/>
-          <w:color w:val="000000"/>
-          <w:sz w:val="24"/>
-          <w:szCs w:val="24"/>
-        </w:rPr>
         <w:t xml:space="preserve">     </w:t>
       </w:r>
       <w:r>
@@ -1728,39 +1196,18 @@
           <w:sz w:val="24"/>
           <w:szCs w:val="14"/>
         </w:rPr>
-        <w:t xml:space="preserve"> </w:t>
-      </w:r>
-      <w:proofErr w:type="spellStart"/>
-      <w:r>
-        <w:rPr>
-          <w:rFonts w:ascii="Times New Roman" w:eastAsia="Times New Roman" w:hAnsi="Times New Roman"/>
-          <w:color w:val="000000"/>
-          <w:sz w:val="24"/>
-          <w:szCs w:val="14"/>
-        </w:rPr>
-        <w:t>Khách</w:t>
-      </w:r>
-      <w:proofErr w:type="spellEnd"/>
-      <w:r>
-        <w:rPr>
-          <w:rFonts w:ascii="Times New Roman" w:eastAsia="Times New Roman" w:hAnsi="Times New Roman"/>
-          <w:color w:val="000000"/>
-          <w:sz w:val="24"/>
-          <w:szCs w:val="14"/>
-        </w:rPr>
-        <w:t xml:space="preserve"> thuê</w:t>
+        <w:t xml:space="preserve"> Khách thuê</w:t>
       </w:r>
     </w:p>
     <w:tbl>
       <w:tblPr>
         <w:tblpPr w:leftFromText="180" w:rightFromText="180" w:vertAnchor="text" w:horzAnchor="page" w:tblpX="5261" w:tblpY="-25"/>
-        <w:tblW w:w="5709" w:type="dxa"/>
+        <w:tblW w:w="5270" w:type="dxa"/>
         <w:tblLook w:val="04A0" w:firstRow="1" w:lastRow="0" w:firstColumn="1" w:lastColumn="0" w:noHBand="0" w:noVBand="1"/>
       </w:tblPr>
       <w:tblGrid>
         <w:gridCol w:w="440"/>
         <w:gridCol w:w="440"/>
-        <w:gridCol w:w="439"/>
         <w:gridCol w:w="439"/>
         <w:gridCol w:w="439"/>
         <w:gridCol w:w="439"/>
@@ -1781,10 +1228,10 @@
             <w:szCs w:val="24"/>
             <w:lang w:val="pt-BR"/>
           </w:rPr>
-          <w:tag w:val="LandlordNationalIdCardNumber"/>
+          <w:tag w:val="Table_PartB"/>
           <w:id w:val="213011653"/>
           <w:placeholder>
-            <w:docPart w:val="C4464C7239DB436787CDA0A4E69DF63B"/>
+            <w:docPart w:val="016B758F79FC4EC9809C0F34ECBB3D7B"/>
           </w:placeholder>
         </w:sdtPr>
         <w:sdtContent>
@@ -2104,32 +1551,6 @@
                 </w:pPr>
               </w:p>
             </w:tc>
-            <w:tc>
-              <w:tcPr>
-                <w:tcW w:w="439" w:type="dxa"/>
-                <w:tcBorders>
-                  <w:top w:val="single" w:sz="4" w:space="0" w:color="auto"/>
-                  <w:left w:val="single" w:sz="4" w:space="0" w:color="auto"/>
-                  <w:bottom w:val="single" w:sz="4" w:space="0" w:color="auto"/>
-                  <w:right w:val="single" w:sz="4" w:space="0" w:color="auto"/>
-                </w:tcBorders>
-              </w:tcPr>
-              <w:p>
-                <w:pPr>
-                  <w:tabs>
-                    <w:tab w:val="left" w:leader="dot" w:pos="10206"/>
-                  </w:tabs>
-                  <w:spacing w:before="100" w:after="100" w:line="240" w:lineRule="auto"/>
-                  <w:rPr>
-                    <w:rFonts w:ascii="Times New Roman" w:eastAsia="Times New Roman" w:hAnsi="Times New Roman"/>
-                    <w:color w:val="000000"/>
-                    <w:sz w:val="24"/>
-                    <w:szCs w:val="24"/>
-                    <w:lang w:val="pt-BR"/>
-                  </w:rPr>
-                </w:pPr>
-              </w:p>
-            </w:tc>
           </w:tr>
         </w:sdtContent>
       </w:sdt>
@@ -2383,47 +1804,7 @@
                 <w:color w:val="000000"/>
                 <w:spacing w:val="-4"/>
               </w:rPr>
-              <w:t xml:space="preserve">Họ, </w:t>
-            </w:r>
-            <w:proofErr w:type="spellStart"/>
-            <w:r>
-              <w:rPr>
-                <w:rFonts w:ascii="Times New Roman" w:eastAsia="Times New Roman" w:hAnsi="Times New Roman"/>
-                <w:b/>
-                <w:color w:val="000000"/>
-                <w:spacing w:val="-4"/>
-              </w:rPr>
-              <w:t>chữ</w:t>
-            </w:r>
-            <w:proofErr w:type="spellEnd"/>
-            <w:r>
-              <w:rPr>
-                <w:rFonts w:ascii="Times New Roman" w:eastAsia="Times New Roman" w:hAnsi="Times New Roman"/>
-                <w:b/>
-                <w:color w:val="000000"/>
-                <w:spacing w:val="-4"/>
-              </w:rPr>
-              <w:t xml:space="preserve"> </w:t>
-            </w:r>
-            <w:proofErr w:type="spellStart"/>
-            <w:r>
-              <w:rPr>
-                <w:rFonts w:ascii="Times New Roman" w:eastAsia="Times New Roman" w:hAnsi="Times New Roman"/>
-                <w:b/>
-                <w:color w:val="000000"/>
-                <w:spacing w:val="-4"/>
-              </w:rPr>
-              <w:t>đệm</w:t>
-            </w:r>
-            <w:proofErr w:type="spellEnd"/>
-            <w:r>
-              <w:rPr>
-                <w:rFonts w:ascii="Times New Roman" w:eastAsia="Times New Roman" w:hAnsi="Times New Roman"/>
-                <w:b/>
-                <w:color w:val="000000"/>
-                <w:spacing w:val="-4"/>
-              </w:rPr>
-              <w:t xml:space="preserve"> </w:t>
+              <w:t xml:space="preserve">Họ, chữ đệm </w:t>
             </w:r>
           </w:p>
           <w:p>
@@ -2437,7 +1818,6 @@
                 <w:spacing w:val="-4"/>
               </w:rPr>
             </w:pPr>
-            <w:proofErr w:type="spellStart"/>
             <w:r>
               <w:rPr>
                 <w:rFonts w:ascii="Times New Roman" w:eastAsia="Times New Roman" w:hAnsi="Times New Roman"/>
@@ -2445,37 +1825,7 @@
                 <w:color w:val="000000"/>
                 <w:spacing w:val="-4"/>
               </w:rPr>
-              <w:t>va</w:t>
-            </w:r>
-            <w:proofErr w:type="spellEnd"/>
-            <w:r>
-              <w:rPr>
-                <w:rFonts w:ascii="Times New Roman" w:eastAsia="Times New Roman" w:hAnsi="Times New Roman"/>
-                <w:b/>
-                <w:color w:val="000000"/>
-                <w:spacing w:val="-4"/>
-              </w:rPr>
-              <w:t xml:space="preserve">̀ </w:t>
-            </w:r>
-            <w:proofErr w:type="spellStart"/>
-            <w:r>
-              <w:rPr>
-                <w:rFonts w:ascii="Times New Roman" w:eastAsia="Times New Roman" w:hAnsi="Times New Roman"/>
-                <w:b/>
-                <w:color w:val="000000"/>
-                <w:spacing w:val="-4"/>
-              </w:rPr>
-              <w:t>tên</w:t>
-            </w:r>
-            <w:proofErr w:type="spellEnd"/>
-            <w:r>
-              <w:rPr>
-                <w:rFonts w:ascii="Times New Roman" w:eastAsia="Times New Roman" w:hAnsi="Times New Roman"/>
-                <w:b/>
-                <w:color w:val="000000"/>
-                <w:spacing w:val="-4"/>
-              </w:rPr>
-              <w:t xml:space="preserve"> </w:t>
+              <w:t xml:space="preserve">và tên </w:t>
             </w:r>
           </w:p>
         </w:tc>
@@ -2501,70 +1851,14 @@
                 <w:spacing w:val="-4"/>
               </w:rPr>
             </w:pPr>
-            <w:proofErr w:type="spellStart"/>
             <w:r>
               <w:rPr>
                 <w:rFonts w:ascii="Times New Roman" w:eastAsia="Times New Roman" w:hAnsi="Times New Roman"/>
                 <w:b/>
                 <w:color w:val="000000"/>
               </w:rPr>
-              <w:t>Ngày</w:t>
+              <w:t>Ngày, tháng, năm sinh</w:t>
             </w:r>
-            <w:proofErr w:type="spellEnd"/>
-            <w:r>
-              <w:rPr>
-                <w:rFonts w:ascii="Times New Roman" w:eastAsia="Times New Roman" w:hAnsi="Times New Roman"/>
-                <w:b/>
-                <w:color w:val="000000"/>
-              </w:rPr>
-              <w:t xml:space="preserve">, </w:t>
-            </w:r>
-            <w:proofErr w:type="spellStart"/>
-            <w:r>
-              <w:rPr>
-                <w:rFonts w:ascii="Times New Roman" w:eastAsia="Times New Roman" w:hAnsi="Times New Roman"/>
-                <w:b/>
-                <w:color w:val="000000"/>
-              </w:rPr>
-              <w:t>tháng</w:t>
-            </w:r>
-            <w:proofErr w:type="spellEnd"/>
-            <w:r>
-              <w:rPr>
-                <w:rFonts w:ascii="Times New Roman" w:eastAsia="Times New Roman" w:hAnsi="Times New Roman"/>
-                <w:b/>
-                <w:color w:val="000000"/>
-              </w:rPr>
-              <w:t xml:space="preserve">, </w:t>
-            </w:r>
-            <w:proofErr w:type="spellStart"/>
-            <w:r>
-              <w:rPr>
-                <w:rFonts w:ascii="Times New Roman" w:eastAsia="Times New Roman" w:hAnsi="Times New Roman"/>
-                <w:b/>
-                <w:color w:val="000000"/>
-              </w:rPr>
-              <w:t>năm</w:t>
-            </w:r>
-            <w:proofErr w:type="spellEnd"/>
-            <w:r>
-              <w:rPr>
-                <w:rFonts w:ascii="Times New Roman" w:eastAsia="Times New Roman" w:hAnsi="Times New Roman"/>
-                <w:b/>
-                <w:color w:val="000000"/>
-              </w:rPr>
-              <w:t xml:space="preserve"> </w:t>
-            </w:r>
-            <w:proofErr w:type="spellStart"/>
-            <w:r>
-              <w:rPr>
-                <w:rFonts w:ascii="Times New Roman" w:eastAsia="Times New Roman" w:hAnsi="Times New Roman"/>
-                <w:b/>
-                <w:color w:val="000000"/>
-              </w:rPr>
-              <w:t>sinh</w:t>
-            </w:r>
-            <w:proofErr w:type="spellEnd"/>
           </w:p>
         </w:tc>
         <w:tc>
@@ -2587,7 +1881,6 @@
                 <w:color w:val="000000"/>
               </w:rPr>
             </w:pPr>
-            <w:proofErr w:type="spellStart"/>
             <w:r>
               <w:rPr>
                 <w:rFonts w:ascii="Times New Roman" w:eastAsia="Times New Roman" w:hAnsi="Times New Roman"/>
@@ -2595,29 +1888,8 @@
                 <w:color w:val="000000"/>
                 <w:spacing w:val="-4"/>
               </w:rPr>
-              <w:t>Giới</w:t>
+              <w:t>Giới tính</w:t>
             </w:r>
-            <w:proofErr w:type="spellEnd"/>
-            <w:r>
-              <w:rPr>
-                <w:rFonts w:ascii="Times New Roman" w:eastAsia="Times New Roman" w:hAnsi="Times New Roman"/>
-                <w:b/>
-                <w:color w:val="000000"/>
-                <w:spacing w:val="-4"/>
-              </w:rPr>
-              <w:t xml:space="preserve"> </w:t>
-            </w:r>
-            <w:proofErr w:type="spellStart"/>
-            <w:r>
-              <w:rPr>
-                <w:rFonts w:ascii="Times New Roman" w:eastAsia="Times New Roman" w:hAnsi="Times New Roman"/>
-                <w:b/>
-                <w:color w:val="000000"/>
-                <w:spacing w:val="-4"/>
-              </w:rPr>
-              <w:t>tính</w:t>
-            </w:r>
-            <w:proofErr w:type="spellEnd"/>
           </w:p>
         </w:tc>
         <w:tc>
@@ -5099,9 +4371,19 @@
           <w:sz w:val="25"/>
           <w:szCs w:val="25"/>
         </w:rPr>
+        <w:t xml:space="preserve"> ghi</w:t>
+      </w:r>
+      <w:r>
+        <w:rPr>
+          <w:rFonts w:ascii="Times New Roman" w:eastAsia="Times New Roman" w:hAnsi="Times New Roman"/>
+          <w:color w:val="000000"/>
+          <w:spacing w:val="-4"/>
+          <w:sz w:val="25"/>
+          <w:szCs w:val="25"/>
+          <w:lang w:val="vi-VN"/>
+        </w:rPr>
         <w:t xml:space="preserve"> </w:t>
       </w:r>
-      <w:proofErr w:type="spellStart"/>
       <w:r>
         <w:rPr>
           <w:rFonts w:ascii="Times New Roman" w:eastAsia="Times New Roman" w:hAnsi="Times New Roman"/>
@@ -5110,9 +4392,8 @@
           <w:sz w:val="25"/>
           <w:szCs w:val="25"/>
         </w:rPr>
-        <w:t>ghi</w:t>
-      </w:r>
-      <w:proofErr w:type="spellEnd"/>
+        <w:t xml:space="preserve">chi tiết </w:t>
+      </w:r>
       <w:r>
         <w:rPr>
           <w:rFonts w:ascii="Times New Roman" w:eastAsia="Times New Roman" w:hAnsi="Times New Roman"/>
@@ -5120,6 +4401,47 @@
           <w:spacing w:val="-4"/>
           <w:sz w:val="25"/>
           <w:szCs w:val="25"/>
+        </w:rPr>
+        <w:t>thông tin nơi</w:t>
+      </w:r>
+      <w:r>
+        <w:rPr>
+          <w:rFonts w:ascii="Times New Roman" w:eastAsia="Times New Roman" w:hAnsi="Times New Roman"/>
+          <w:color w:val="000000"/>
+          <w:spacing w:val="-4"/>
+          <w:sz w:val="25"/>
+          <w:szCs w:val="25"/>
+        </w:rPr>
+        <w:t xml:space="preserve"> đề nghị </w:t>
+      </w:r>
+      <w:r>
+        <w:rPr>
+          <w:rFonts w:ascii="Times New Roman" w:eastAsia="Times New Roman" w:hAnsi="Times New Roman"/>
+          <w:color w:val="000000"/>
+          <w:spacing w:val="-4"/>
+          <w:sz w:val="25"/>
+          <w:szCs w:val="25"/>
+          <w:lang w:val="vi-VN"/>
+        </w:rPr>
+        <w:t>đăng ký thường trú</w:t>
+      </w:r>
+      <w:r>
+        <w:rPr>
+          <w:rFonts w:ascii="Times New Roman" w:eastAsia="Times New Roman" w:hAnsi="Times New Roman"/>
+          <w:color w:val="000000"/>
+          <w:spacing w:val="-4"/>
+          <w:sz w:val="25"/>
+          <w:szCs w:val="25"/>
+        </w:rPr>
+        <w:t xml:space="preserve"> hoặc</w:t>
+      </w:r>
+      <w:r>
+        <w:rPr>
+          <w:rFonts w:ascii="Times New Roman" w:eastAsia="Times New Roman" w:hAnsi="Times New Roman"/>
+          <w:color w:val="000000"/>
+          <w:spacing w:val="-4"/>
+          <w:sz w:val="25"/>
+          <w:szCs w:val="25"/>
           <w:lang w:val="vi-VN"/>
         </w:rPr>
         <w:t xml:space="preserve"> </w:t>
@@ -5132,9 +4454,8 @@
           <w:sz w:val="25"/>
           <w:szCs w:val="25"/>
         </w:rPr>
-        <w:t xml:space="preserve">chi </w:t>
-      </w:r>
-      <w:proofErr w:type="spellStart"/>
+        <w:t xml:space="preserve">nơi đề nghị </w:t>
+      </w:r>
       <w:r>
         <w:rPr>
           <w:rFonts w:ascii="Times New Roman" w:eastAsia="Times New Roman" w:hAnsi="Times New Roman"/>
@@ -5142,10 +4463,10 @@
           <w:spacing w:val="-4"/>
           <w:sz w:val="25"/>
           <w:szCs w:val="25"/>
-        </w:rPr>
-        <w:t>tiết</w:t>
-      </w:r>
-      <w:proofErr w:type="spellEnd"/>
+          <w:lang w:val="vi-VN"/>
+        </w:rPr>
+        <w:t>đăng ký tạm trú</w:t>
+      </w:r>
       <w:r>
         <w:rPr>
           <w:rFonts w:ascii="Times New Roman" w:eastAsia="Times New Roman" w:hAnsi="Times New Roman"/>
@@ -5154,9 +4475,8 @@
           <w:sz w:val="25"/>
           <w:szCs w:val="25"/>
         </w:rPr>
-        <w:t xml:space="preserve"> </w:t>
-      </w:r>
-      <w:proofErr w:type="spellStart"/>
+        <w:t xml:space="preserve"> hoặc </w:t>
+      </w:r>
       <w:r>
         <w:rPr>
           <w:rFonts w:ascii="Times New Roman" w:eastAsia="Times New Roman" w:hAnsi="Times New Roman"/>
@@ -5165,303 +4485,7 @@
           <w:sz w:val="25"/>
           <w:szCs w:val="25"/>
         </w:rPr>
-        <w:t>thông</w:t>
-      </w:r>
-      <w:proofErr w:type="spellEnd"/>
-      <w:r>
-        <w:rPr>
-          <w:rFonts w:ascii="Times New Roman" w:eastAsia="Times New Roman" w:hAnsi="Times New Roman"/>
-          <w:color w:val="000000"/>
-          <w:spacing w:val="-4"/>
-          <w:sz w:val="25"/>
-          <w:szCs w:val="25"/>
-        </w:rPr>
-        <w:t xml:space="preserve"> tin </w:t>
-      </w:r>
-      <w:proofErr w:type="spellStart"/>
-      <w:r>
-        <w:rPr>
-          <w:rFonts w:ascii="Times New Roman" w:eastAsia="Times New Roman" w:hAnsi="Times New Roman"/>
-          <w:color w:val="000000"/>
-          <w:spacing w:val="-4"/>
-          <w:sz w:val="25"/>
-          <w:szCs w:val="25"/>
-        </w:rPr>
-        <w:t>nơi</w:t>
-      </w:r>
-      <w:proofErr w:type="spellEnd"/>
-      <w:r>
-        <w:rPr>
-          <w:rFonts w:ascii="Times New Roman" w:eastAsia="Times New Roman" w:hAnsi="Times New Roman"/>
-          <w:color w:val="000000"/>
-          <w:spacing w:val="-4"/>
-          <w:sz w:val="25"/>
-          <w:szCs w:val="25"/>
-        </w:rPr>
-        <w:t xml:space="preserve"> </w:t>
-      </w:r>
-      <w:proofErr w:type="spellStart"/>
-      <w:r>
-        <w:rPr>
-          <w:rFonts w:ascii="Times New Roman" w:eastAsia="Times New Roman" w:hAnsi="Times New Roman"/>
-          <w:color w:val="000000"/>
-          <w:spacing w:val="-4"/>
-          <w:sz w:val="25"/>
-          <w:szCs w:val="25"/>
-        </w:rPr>
-        <w:t>đề</w:t>
-      </w:r>
-      <w:proofErr w:type="spellEnd"/>
-      <w:r>
-        <w:rPr>
-          <w:rFonts w:ascii="Times New Roman" w:eastAsia="Times New Roman" w:hAnsi="Times New Roman"/>
-          <w:color w:val="000000"/>
-          <w:spacing w:val="-4"/>
-          <w:sz w:val="25"/>
-          <w:szCs w:val="25"/>
-        </w:rPr>
-        <w:t xml:space="preserve"> </w:t>
-      </w:r>
-      <w:proofErr w:type="spellStart"/>
-      <w:r>
-        <w:rPr>
-          <w:rFonts w:ascii="Times New Roman" w:eastAsia="Times New Roman" w:hAnsi="Times New Roman"/>
-          <w:color w:val="000000"/>
-          <w:spacing w:val="-4"/>
-          <w:sz w:val="25"/>
-          <w:szCs w:val="25"/>
-        </w:rPr>
-        <w:t>nghị</w:t>
-      </w:r>
-      <w:proofErr w:type="spellEnd"/>
-      <w:r>
-        <w:rPr>
-          <w:rFonts w:ascii="Times New Roman" w:eastAsia="Times New Roman" w:hAnsi="Times New Roman"/>
-          <w:color w:val="000000"/>
-          <w:spacing w:val="-4"/>
-          <w:sz w:val="25"/>
-          <w:szCs w:val="25"/>
-        </w:rPr>
-        <w:t xml:space="preserve"> </w:t>
-      </w:r>
-      <w:r>
-        <w:rPr>
-          <w:rFonts w:ascii="Times New Roman" w:eastAsia="Times New Roman" w:hAnsi="Times New Roman"/>
-          <w:color w:val="000000"/>
-          <w:spacing w:val="-4"/>
-          <w:sz w:val="25"/>
-          <w:szCs w:val="25"/>
-          <w:lang w:val="vi-VN"/>
-        </w:rPr>
-        <w:t>đăng ký thường trú</w:t>
-      </w:r>
-      <w:r>
-        <w:rPr>
-          <w:rFonts w:ascii="Times New Roman" w:eastAsia="Times New Roman" w:hAnsi="Times New Roman"/>
-          <w:color w:val="000000"/>
-          <w:spacing w:val="-4"/>
-          <w:sz w:val="25"/>
-          <w:szCs w:val="25"/>
-        </w:rPr>
-        <w:t xml:space="preserve"> </w:t>
-      </w:r>
-      <w:proofErr w:type="spellStart"/>
-      <w:r>
-        <w:rPr>
-          <w:rFonts w:ascii="Times New Roman" w:eastAsia="Times New Roman" w:hAnsi="Times New Roman"/>
-          <w:color w:val="000000"/>
-          <w:spacing w:val="-4"/>
-          <w:sz w:val="25"/>
-          <w:szCs w:val="25"/>
-        </w:rPr>
-        <w:t>hoặc</w:t>
-      </w:r>
-      <w:proofErr w:type="spellEnd"/>
-      <w:r>
-        <w:rPr>
-          <w:rFonts w:ascii="Times New Roman" w:eastAsia="Times New Roman" w:hAnsi="Times New Roman"/>
-          <w:color w:val="000000"/>
-          <w:spacing w:val="-4"/>
-          <w:sz w:val="25"/>
-          <w:szCs w:val="25"/>
-          <w:lang w:val="vi-VN"/>
-        </w:rPr>
-        <w:t xml:space="preserve"> </w:t>
-      </w:r>
-      <w:proofErr w:type="spellStart"/>
-      <w:r>
-        <w:rPr>
-          <w:rFonts w:ascii="Times New Roman" w:eastAsia="Times New Roman" w:hAnsi="Times New Roman"/>
-          <w:color w:val="000000"/>
-          <w:spacing w:val="-4"/>
-          <w:sz w:val="25"/>
-          <w:szCs w:val="25"/>
-        </w:rPr>
-        <w:t>nơi</w:t>
-      </w:r>
-      <w:proofErr w:type="spellEnd"/>
-      <w:r>
-        <w:rPr>
-          <w:rFonts w:ascii="Times New Roman" w:eastAsia="Times New Roman" w:hAnsi="Times New Roman"/>
-          <w:color w:val="000000"/>
-          <w:spacing w:val="-4"/>
-          <w:sz w:val="25"/>
-          <w:szCs w:val="25"/>
-        </w:rPr>
-        <w:t xml:space="preserve"> </w:t>
-      </w:r>
-      <w:proofErr w:type="spellStart"/>
-      <w:r>
-        <w:rPr>
-          <w:rFonts w:ascii="Times New Roman" w:eastAsia="Times New Roman" w:hAnsi="Times New Roman"/>
-          <w:color w:val="000000"/>
-          <w:spacing w:val="-4"/>
-          <w:sz w:val="25"/>
-          <w:szCs w:val="25"/>
-        </w:rPr>
-        <w:t>đề</w:t>
-      </w:r>
-      <w:proofErr w:type="spellEnd"/>
-      <w:r>
-        <w:rPr>
-          <w:rFonts w:ascii="Times New Roman" w:eastAsia="Times New Roman" w:hAnsi="Times New Roman"/>
-          <w:color w:val="000000"/>
-          <w:spacing w:val="-4"/>
-          <w:sz w:val="25"/>
-          <w:szCs w:val="25"/>
-        </w:rPr>
-        <w:t xml:space="preserve"> </w:t>
-      </w:r>
-      <w:proofErr w:type="spellStart"/>
-      <w:r>
-        <w:rPr>
-          <w:rFonts w:ascii="Times New Roman" w:eastAsia="Times New Roman" w:hAnsi="Times New Roman"/>
-          <w:color w:val="000000"/>
-          <w:spacing w:val="-4"/>
-          <w:sz w:val="25"/>
-          <w:szCs w:val="25"/>
-        </w:rPr>
-        <w:t>nghị</w:t>
-      </w:r>
-      <w:proofErr w:type="spellEnd"/>
-      <w:r>
-        <w:rPr>
-          <w:rFonts w:ascii="Times New Roman" w:eastAsia="Times New Roman" w:hAnsi="Times New Roman"/>
-          <w:color w:val="000000"/>
-          <w:spacing w:val="-4"/>
-          <w:sz w:val="25"/>
-          <w:szCs w:val="25"/>
-        </w:rPr>
-        <w:t xml:space="preserve"> </w:t>
-      </w:r>
-      <w:r>
-        <w:rPr>
-          <w:rFonts w:ascii="Times New Roman" w:eastAsia="Times New Roman" w:hAnsi="Times New Roman"/>
-          <w:color w:val="000000"/>
-          <w:spacing w:val="-4"/>
-          <w:sz w:val="25"/>
-          <w:szCs w:val="25"/>
-          <w:lang w:val="vi-VN"/>
-        </w:rPr>
-        <w:t>đăng ký tạm trú</w:t>
-      </w:r>
-      <w:r>
-        <w:rPr>
-          <w:rFonts w:ascii="Times New Roman" w:eastAsia="Times New Roman" w:hAnsi="Times New Roman"/>
-          <w:color w:val="000000"/>
-          <w:spacing w:val="-4"/>
-          <w:sz w:val="25"/>
-          <w:szCs w:val="25"/>
-        </w:rPr>
-        <w:t xml:space="preserve"> </w:t>
-      </w:r>
-      <w:proofErr w:type="spellStart"/>
-      <w:r>
-        <w:rPr>
-          <w:rFonts w:ascii="Times New Roman" w:eastAsia="Times New Roman" w:hAnsi="Times New Roman"/>
-          <w:color w:val="000000"/>
-          <w:spacing w:val="-4"/>
-          <w:sz w:val="25"/>
-          <w:szCs w:val="25"/>
-        </w:rPr>
-        <w:t>hoặc</w:t>
-      </w:r>
-      <w:proofErr w:type="spellEnd"/>
-      <w:r>
-        <w:rPr>
-          <w:rFonts w:ascii="Times New Roman" w:eastAsia="Times New Roman" w:hAnsi="Times New Roman"/>
-          <w:color w:val="000000"/>
-          <w:spacing w:val="-4"/>
-          <w:sz w:val="25"/>
-          <w:szCs w:val="25"/>
-        </w:rPr>
-        <w:t xml:space="preserve"> </w:t>
-      </w:r>
-      <w:proofErr w:type="spellStart"/>
-      <w:r>
-        <w:rPr>
-          <w:rFonts w:ascii="Times New Roman" w:eastAsia="Times New Roman" w:hAnsi="Times New Roman"/>
-          <w:color w:val="000000"/>
-          <w:spacing w:val="-4"/>
-          <w:sz w:val="25"/>
-          <w:szCs w:val="25"/>
-        </w:rPr>
-        <w:t>nội</w:t>
-      </w:r>
-      <w:proofErr w:type="spellEnd"/>
-      <w:r>
-        <w:rPr>
-          <w:rFonts w:ascii="Times New Roman" w:eastAsia="Times New Roman" w:hAnsi="Times New Roman"/>
-          <w:color w:val="000000"/>
-          <w:spacing w:val="-4"/>
-          <w:sz w:val="25"/>
-          <w:szCs w:val="25"/>
-        </w:rPr>
-        <w:t xml:space="preserve"> dung </w:t>
-      </w:r>
-      <w:proofErr w:type="spellStart"/>
-      <w:r>
-        <w:rPr>
-          <w:rFonts w:ascii="Times New Roman" w:eastAsia="Times New Roman" w:hAnsi="Times New Roman"/>
-          <w:color w:val="000000"/>
-          <w:spacing w:val="-4"/>
-          <w:sz w:val="25"/>
-          <w:szCs w:val="25"/>
-        </w:rPr>
-        <w:t>đề</w:t>
-      </w:r>
-      <w:proofErr w:type="spellEnd"/>
-      <w:r>
-        <w:rPr>
-          <w:rFonts w:ascii="Times New Roman" w:eastAsia="Times New Roman" w:hAnsi="Times New Roman"/>
-          <w:color w:val="000000"/>
-          <w:spacing w:val="-4"/>
-          <w:sz w:val="25"/>
-          <w:szCs w:val="25"/>
-        </w:rPr>
-        <w:t xml:space="preserve"> </w:t>
-      </w:r>
-      <w:proofErr w:type="spellStart"/>
-      <w:r>
-        <w:rPr>
-          <w:rFonts w:ascii="Times New Roman" w:eastAsia="Times New Roman" w:hAnsi="Times New Roman"/>
-          <w:color w:val="000000"/>
-          <w:spacing w:val="-4"/>
-          <w:sz w:val="25"/>
-          <w:szCs w:val="25"/>
-        </w:rPr>
-        <w:t>nghị</w:t>
-      </w:r>
-      <w:proofErr w:type="spellEnd"/>
-      <w:r>
-        <w:rPr>
-          <w:rFonts w:ascii="Times New Roman" w:eastAsia="Times New Roman" w:hAnsi="Times New Roman"/>
-          <w:color w:val="000000"/>
-          <w:spacing w:val="-4"/>
-          <w:sz w:val="25"/>
-          <w:szCs w:val="25"/>
-        </w:rPr>
-        <w:t xml:space="preserve"> </w:t>
+        <w:t xml:space="preserve">nội dung đề nghị </w:t>
       </w:r>
       <w:r>
         <w:rPr>
@@ -5518,367 +4542,7 @@
           <w:sz w:val="25"/>
           <w:szCs w:val="25"/>
         </w:rPr>
-        <w:t>(</w:t>
-      </w:r>
-      <w:proofErr w:type="spellStart"/>
-      <w:r>
-        <w:rPr>
-          <w:rFonts w:ascii="Times New Roman" w:eastAsia="Times New Roman" w:hAnsi="Times New Roman"/>
-          <w:i/>
-          <w:color w:val="000000"/>
-          <w:spacing w:val="-6"/>
-          <w:sz w:val="25"/>
-          <w:szCs w:val="25"/>
-        </w:rPr>
-        <w:t>trường</w:t>
-      </w:r>
-      <w:proofErr w:type="spellEnd"/>
-      <w:r>
-        <w:rPr>
-          <w:rFonts w:ascii="Times New Roman" w:eastAsia="Times New Roman" w:hAnsi="Times New Roman"/>
-          <w:i/>
-          <w:color w:val="000000"/>
-          <w:spacing w:val="-6"/>
-          <w:sz w:val="25"/>
-          <w:szCs w:val="25"/>
-        </w:rPr>
-        <w:t xml:space="preserve"> </w:t>
-      </w:r>
-      <w:proofErr w:type="spellStart"/>
-      <w:r>
-        <w:rPr>
-          <w:rFonts w:ascii="Times New Roman" w:eastAsia="Times New Roman" w:hAnsi="Times New Roman"/>
-          <w:i/>
-          <w:color w:val="000000"/>
-          <w:spacing w:val="-6"/>
-          <w:sz w:val="25"/>
-          <w:szCs w:val="25"/>
-        </w:rPr>
-        <w:t>hợp</w:t>
-      </w:r>
-      <w:proofErr w:type="spellEnd"/>
-      <w:r>
-        <w:rPr>
-          <w:rFonts w:ascii="Times New Roman" w:eastAsia="Times New Roman" w:hAnsi="Times New Roman"/>
-          <w:i/>
-          <w:color w:val="000000"/>
-          <w:spacing w:val="-6"/>
-          <w:sz w:val="25"/>
-          <w:szCs w:val="25"/>
-        </w:rPr>
-        <w:t xml:space="preserve"> </w:t>
-      </w:r>
-      <w:proofErr w:type="spellStart"/>
-      <w:r>
-        <w:rPr>
-          <w:rFonts w:ascii="Times New Roman" w:eastAsia="Times New Roman" w:hAnsi="Times New Roman"/>
-          <w:i/>
-          <w:color w:val="000000"/>
-          <w:spacing w:val="-6"/>
-          <w:sz w:val="25"/>
-          <w:szCs w:val="25"/>
-        </w:rPr>
-        <w:t>người</w:t>
-      </w:r>
-      <w:proofErr w:type="spellEnd"/>
-      <w:r>
-        <w:rPr>
-          <w:rFonts w:ascii="Times New Roman" w:eastAsia="Times New Roman" w:hAnsi="Times New Roman"/>
-          <w:i/>
-          <w:color w:val="000000"/>
-          <w:spacing w:val="-6"/>
-          <w:sz w:val="25"/>
-          <w:szCs w:val="25"/>
-        </w:rPr>
-        <w:t xml:space="preserve"> </w:t>
-      </w:r>
-      <w:proofErr w:type="spellStart"/>
-      <w:r>
-        <w:rPr>
-          <w:rFonts w:ascii="Times New Roman" w:eastAsia="Times New Roman" w:hAnsi="Times New Roman"/>
-          <w:i/>
-          <w:color w:val="000000"/>
-          <w:spacing w:val="-6"/>
-          <w:sz w:val="25"/>
-          <w:szCs w:val="25"/>
-        </w:rPr>
-        <w:t>đứng</w:t>
-      </w:r>
-      <w:proofErr w:type="spellEnd"/>
-      <w:r>
-        <w:rPr>
-          <w:rFonts w:ascii="Times New Roman" w:eastAsia="Times New Roman" w:hAnsi="Times New Roman"/>
-          <w:i/>
-          <w:color w:val="000000"/>
-          <w:spacing w:val="-6"/>
-          <w:sz w:val="25"/>
-          <w:szCs w:val="25"/>
-        </w:rPr>
-        <w:t xml:space="preserve"> </w:t>
-      </w:r>
-      <w:proofErr w:type="spellStart"/>
-      <w:r>
-        <w:rPr>
-          <w:rFonts w:ascii="Times New Roman" w:eastAsia="Times New Roman" w:hAnsi="Times New Roman"/>
-          <w:i/>
-          <w:color w:val="000000"/>
-          <w:spacing w:val="-6"/>
-          <w:sz w:val="25"/>
-          <w:szCs w:val="25"/>
-        </w:rPr>
-        <w:t>đầu</w:t>
-      </w:r>
-      <w:proofErr w:type="spellEnd"/>
-      <w:r>
-        <w:rPr>
-          <w:rFonts w:ascii="Times New Roman" w:eastAsia="Times New Roman" w:hAnsi="Times New Roman"/>
-          <w:i/>
-          <w:color w:val="000000"/>
-          <w:spacing w:val="-6"/>
-          <w:sz w:val="25"/>
-          <w:szCs w:val="25"/>
-        </w:rPr>
-        <w:t xml:space="preserve"> </w:t>
-      </w:r>
-      <w:proofErr w:type="spellStart"/>
-      <w:r>
-        <w:rPr>
-          <w:rFonts w:ascii="Times New Roman" w:eastAsia="Times New Roman" w:hAnsi="Times New Roman"/>
-          <w:i/>
-          <w:color w:val="000000"/>
-          <w:spacing w:val="-6"/>
-          <w:sz w:val="25"/>
-          <w:szCs w:val="25"/>
-        </w:rPr>
-        <w:t>cơ</w:t>
-      </w:r>
-      <w:proofErr w:type="spellEnd"/>
-      <w:r>
-        <w:rPr>
-          <w:rFonts w:ascii="Times New Roman" w:eastAsia="Times New Roman" w:hAnsi="Times New Roman"/>
-          <w:i/>
-          <w:color w:val="000000"/>
-          <w:spacing w:val="-6"/>
-          <w:sz w:val="25"/>
-          <w:szCs w:val="25"/>
-        </w:rPr>
-        <w:t xml:space="preserve"> </w:t>
-      </w:r>
-      <w:proofErr w:type="spellStart"/>
-      <w:r>
-        <w:rPr>
-          <w:rFonts w:ascii="Times New Roman" w:eastAsia="Times New Roman" w:hAnsi="Times New Roman"/>
-          <w:i/>
-          <w:color w:val="000000"/>
-          <w:spacing w:val="-6"/>
-          <w:sz w:val="25"/>
-          <w:szCs w:val="25"/>
-        </w:rPr>
-        <w:t>sở</w:t>
-      </w:r>
-      <w:proofErr w:type="spellEnd"/>
-      <w:r>
-        <w:rPr>
-          <w:rFonts w:ascii="Times New Roman" w:eastAsia="Times New Roman" w:hAnsi="Times New Roman"/>
-          <w:i/>
-          <w:color w:val="000000"/>
-          <w:spacing w:val="-6"/>
-          <w:sz w:val="25"/>
-          <w:szCs w:val="25"/>
-        </w:rPr>
-        <w:t xml:space="preserve"> </w:t>
-      </w:r>
-      <w:proofErr w:type="spellStart"/>
-      <w:r>
-        <w:rPr>
-          <w:rFonts w:ascii="Times New Roman" w:eastAsia="Times New Roman" w:hAnsi="Times New Roman"/>
-          <w:i/>
-          <w:color w:val="000000"/>
-          <w:spacing w:val="-6"/>
-          <w:sz w:val="25"/>
-          <w:szCs w:val="25"/>
-        </w:rPr>
-        <w:t>trợ</w:t>
-      </w:r>
-      <w:proofErr w:type="spellEnd"/>
-      <w:r>
-        <w:rPr>
-          <w:rFonts w:ascii="Times New Roman" w:eastAsia="Times New Roman" w:hAnsi="Times New Roman"/>
-          <w:i/>
-          <w:color w:val="000000"/>
-          <w:spacing w:val="-6"/>
-          <w:sz w:val="25"/>
-          <w:szCs w:val="25"/>
-        </w:rPr>
-        <w:t xml:space="preserve"> </w:t>
-      </w:r>
-      <w:proofErr w:type="spellStart"/>
-      <w:r>
-        <w:rPr>
-          <w:rFonts w:ascii="Times New Roman" w:eastAsia="Times New Roman" w:hAnsi="Times New Roman"/>
-          <w:i/>
-          <w:color w:val="000000"/>
-          <w:spacing w:val="-6"/>
-          <w:sz w:val="25"/>
-          <w:szCs w:val="25"/>
-        </w:rPr>
-        <w:t>giúp</w:t>
-      </w:r>
-      <w:proofErr w:type="spellEnd"/>
-      <w:r>
-        <w:rPr>
-          <w:rFonts w:ascii="Times New Roman" w:eastAsia="Times New Roman" w:hAnsi="Times New Roman"/>
-          <w:i/>
-          <w:color w:val="000000"/>
-          <w:spacing w:val="-6"/>
-          <w:sz w:val="25"/>
-          <w:szCs w:val="25"/>
-        </w:rPr>
-        <w:t xml:space="preserve"> </w:t>
-      </w:r>
-      <w:proofErr w:type="spellStart"/>
-      <w:r>
-        <w:rPr>
-          <w:rFonts w:ascii="Times New Roman" w:eastAsia="Times New Roman" w:hAnsi="Times New Roman"/>
-          <w:i/>
-          <w:color w:val="000000"/>
-          <w:spacing w:val="-6"/>
-          <w:sz w:val="25"/>
-          <w:szCs w:val="25"/>
-        </w:rPr>
-        <w:t>xã</w:t>
-      </w:r>
-      <w:proofErr w:type="spellEnd"/>
-      <w:r>
-        <w:rPr>
-          <w:rFonts w:ascii="Times New Roman" w:eastAsia="Times New Roman" w:hAnsi="Times New Roman"/>
-          <w:i/>
-          <w:color w:val="000000"/>
-          <w:spacing w:val="-6"/>
-          <w:sz w:val="25"/>
-          <w:szCs w:val="25"/>
-        </w:rPr>
-        <w:t xml:space="preserve"> </w:t>
-      </w:r>
-      <w:proofErr w:type="spellStart"/>
-      <w:r>
-        <w:rPr>
-          <w:rFonts w:ascii="Times New Roman" w:eastAsia="Times New Roman" w:hAnsi="Times New Roman"/>
-          <w:i/>
-          <w:color w:val="000000"/>
-          <w:spacing w:val="-6"/>
-          <w:sz w:val="25"/>
-          <w:szCs w:val="25"/>
-        </w:rPr>
-        <w:t>hội</w:t>
-      </w:r>
-      <w:proofErr w:type="spellEnd"/>
-      <w:r>
-        <w:rPr>
-          <w:rFonts w:ascii="Times New Roman" w:eastAsia="Times New Roman" w:hAnsi="Times New Roman"/>
-          <w:i/>
-          <w:color w:val="000000"/>
-          <w:spacing w:val="-6"/>
-          <w:sz w:val="25"/>
-          <w:szCs w:val="25"/>
-        </w:rPr>
-        <w:t xml:space="preserve"> </w:t>
-      </w:r>
-      <w:proofErr w:type="spellStart"/>
-      <w:r>
-        <w:rPr>
-          <w:rFonts w:ascii="Times New Roman" w:eastAsia="Times New Roman" w:hAnsi="Times New Roman"/>
-          <w:i/>
-          <w:color w:val="000000"/>
-          <w:spacing w:val="-6"/>
-          <w:sz w:val="25"/>
-          <w:szCs w:val="25"/>
-        </w:rPr>
-        <w:t>quyết</w:t>
-      </w:r>
-      <w:proofErr w:type="spellEnd"/>
-      <w:r>
-        <w:rPr>
-          <w:rFonts w:ascii="Times New Roman" w:eastAsia="Times New Roman" w:hAnsi="Times New Roman"/>
-          <w:i/>
-          <w:color w:val="000000"/>
-          <w:spacing w:val="-6"/>
-          <w:sz w:val="25"/>
-          <w:szCs w:val="25"/>
-        </w:rPr>
-        <w:t xml:space="preserve"> </w:t>
-      </w:r>
-      <w:proofErr w:type="spellStart"/>
-      <w:r>
-        <w:rPr>
-          <w:rFonts w:ascii="Times New Roman" w:eastAsia="Times New Roman" w:hAnsi="Times New Roman"/>
-          <w:i/>
-          <w:color w:val="000000"/>
-          <w:spacing w:val="-6"/>
-          <w:sz w:val="25"/>
-          <w:szCs w:val="25"/>
-        </w:rPr>
-        <w:t>định</w:t>
-      </w:r>
-      <w:proofErr w:type="spellEnd"/>
-      <w:r>
-        <w:rPr>
-          <w:rFonts w:ascii="Times New Roman" w:eastAsia="Times New Roman" w:hAnsi="Times New Roman"/>
-          <w:i/>
-          <w:color w:val="000000"/>
-          <w:spacing w:val="-6"/>
-          <w:sz w:val="25"/>
-          <w:szCs w:val="25"/>
-        </w:rPr>
-        <w:t xml:space="preserve"> </w:t>
-      </w:r>
-      <w:proofErr w:type="spellStart"/>
-      <w:r>
-        <w:rPr>
-          <w:rFonts w:ascii="Times New Roman" w:eastAsia="Times New Roman" w:hAnsi="Times New Roman"/>
-          <w:i/>
-          <w:color w:val="000000"/>
-          <w:spacing w:val="-6"/>
-          <w:sz w:val="25"/>
-          <w:szCs w:val="25"/>
-        </w:rPr>
-        <w:t>chủ</w:t>
-      </w:r>
-      <w:proofErr w:type="spellEnd"/>
-      <w:r>
-        <w:rPr>
-          <w:rFonts w:ascii="Times New Roman" w:eastAsia="Times New Roman" w:hAnsi="Times New Roman"/>
-          <w:i/>
-          <w:color w:val="000000"/>
-          <w:spacing w:val="-6"/>
-          <w:sz w:val="25"/>
-          <w:szCs w:val="25"/>
-        </w:rPr>
-        <w:t xml:space="preserve"> </w:t>
-      </w:r>
-      <w:proofErr w:type="spellStart"/>
-      <w:r>
-        <w:rPr>
-          <w:rFonts w:ascii="Times New Roman" w:eastAsia="Times New Roman" w:hAnsi="Times New Roman"/>
-          <w:i/>
-          <w:color w:val="000000"/>
-          <w:spacing w:val="-6"/>
-          <w:sz w:val="25"/>
-          <w:szCs w:val="25"/>
-        </w:rPr>
-        <w:t>hộ</w:t>
-      </w:r>
-      <w:proofErr w:type="spellEnd"/>
-      <w:r>
-        <w:rPr>
-          <w:rFonts w:ascii="Times New Roman" w:eastAsia="Times New Roman" w:hAnsi="Times New Roman"/>
-          <w:i/>
-          <w:color w:val="000000"/>
-          <w:spacing w:val="-6"/>
-          <w:sz w:val="25"/>
-          <w:szCs w:val="25"/>
-        </w:rPr>
-        <w:t>)</w:t>
+        <w:t>(trường hợp người đứng đầu cơ sở trợ giúp xã hội quyết định chủ hộ)</w:t>
       </w:r>
       <w:r>
         <w:rPr>
@@ -5937,7 +4601,6 @@
         </w:rPr>
         <w:t xml:space="preserve">b) Chủ hộ xác nhận nội dung đồng ý thông qua ứng dụng </w:t>
       </w:r>
-      <w:proofErr w:type="spellStart"/>
       <w:r>
         <w:rPr>
           <w:rFonts w:ascii="Times New Roman" w:eastAsia="Times New Roman" w:hAnsi="Times New Roman"/>
@@ -5946,75 +4609,8 @@
           <w:sz w:val="25"/>
           <w:szCs w:val="25"/>
         </w:rPr>
-        <w:t>định</w:t>
-      </w:r>
-      <w:proofErr w:type="spellEnd"/>
-      <w:r>
-        <w:rPr>
-          <w:rFonts w:ascii="Times New Roman" w:eastAsia="Times New Roman" w:hAnsi="Times New Roman"/>
-          <w:color w:val="000000"/>
-          <w:spacing w:val="-4"/>
-          <w:sz w:val="25"/>
-          <w:szCs w:val="25"/>
-        </w:rPr>
-        <w:t xml:space="preserve"> </w:t>
-      </w:r>
-      <w:proofErr w:type="spellStart"/>
-      <w:r>
-        <w:rPr>
-          <w:rFonts w:ascii="Times New Roman" w:eastAsia="Times New Roman" w:hAnsi="Times New Roman"/>
-          <w:color w:val="000000"/>
-          <w:spacing w:val="-4"/>
-          <w:sz w:val="25"/>
-          <w:szCs w:val="25"/>
-        </w:rPr>
-        <w:t>danh</w:t>
-      </w:r>
-      <w:proofErr w:type="spellEnd"/>
-      <w:r>
-        <w:rPr>
-          <w:rFonts w:ascii="Times New Roman" w:eastAsia="Times New Roman" w:hAnsi="Times New Roman"/>
-          <w:color w:val="000000"/>
-          <w:spacing w:val="-4"/>
-          <w:sz w:val="25"/>
-          <w:szCs w:val="25"/>
-        </w:rPr>
-        <w:t xml:space="preserve"> </w:t>
-      </w:r>
-      <w:proofErr w:type="spellStart"/>
-      <w:r>
-        <w:rPr>
-          <w:rFonts w:ascii="Times New Roman" w:eastAsia="Times New Roman" w:hAnsi="Times New Roman"/>
-          <w:color w:val="000000"/>
-          <w:spacing w:val="-4"/>
-          <w:sz w:val="25"/>
-          <w:szCs w:val="25"/>
-        </w:rPr>
-        <w:t>quốc</w:t>
-      </w:r>
-      <w:proofErr w:type="spellEnd"/>
-      <w:r>
-        <w:rPr>
-          <w:rFonts w:ascii="Times New Roman" w:eastAsia="Times New Roman" w:hAnsi="Times New Roman"/>
-          <w:color w:val="000000"/>
-          <w:spacing w:val="-4"/>
-          <w:sz w:val="25"/>
-          <w:szCs w:val="25"/>
-        </w:rPr>
-        <w:t xml:space="preserve"> </w:t>
-      </w:r>
-      <w:proofErr w:type="spellStart"/>
-      <w:r>
-        <w:rPr>
-          <w:rFonts w:ascii="Times New Roman" w:eastAsia="Times New Roman" w:hAnsi="Times New Roman"/>
-          <w:color w:val="000000"/>
-          <w:spacing w:val="-4"/>
-          <w:sz w:val="25"/>
-          <w:szCs w:val="25"/>
-        </w:rPr>
-        <w:t>gia</w:t>
-      </w:r>
-      <w:proofErr w:type="spellEnd"/>
+        <w:t>định danh quốc gia</w:t>
+      </w:r>
       <w:r>
         <w:rPr>
           <w:rFonts w:ascii="Times New Roman" w:eastAsia="Times New Roman" w:hAnsi="Times New Roman"/>
@@ -6135,7 +4731,6 @@
         </w:rPr>
         <w:t xml:space="preserve">b) Chủ sở hữu chỗ ở hợp pháp xác nhận nội dung đồng ý thông qua ứng dụng </w:t>
       </w:r>
-      <w:proofErr w:type="spellStart"/>
       <w:r>
         <w:rPr>
           <w:rFonts w:ascii="Times New Roman" w:eastAsia="Times New Roman" w:hAnsi="Times New Roman"/>
@@ -6144,75 +4739,8 @@
           <w:sz w:val="25"/>
           <w:szCs w:val="25"/>
         </w:rPr>
-        <w:t>định</w:t>
-      </w:r>
-      <w:proofErr w:type="spellEnd"/>
-      <w:r>
-        <w:rPr>
-          <w:rFonts w:ascii="Times New Roman" w:eastAsia="Times New Roman" w:hAnsi="Times New Roman"/>
-          <w:color w:val="000000"/>
-          <w:spacing w:val="-4"/>
-          <w:sz w:val="25"/>
-          <w:szCs w:val="25"/>
-        </w:rPr>
-        <w:t xml:space="preserve"> </w:t>
-      </w:r>
-      <w:proofErr w:type="spellStart"/>
-      <w:r>
-        <w:rPr>
-          <w:rFonts w:ascii="Times New Roman" w:eastAsia="Times New Roman" w:hAnsi="Times New Roman"/>
-          <w:color w:val="000000"/>
-          <w:spacing w:val="-4"/>
-          <w:sz w:val="25"/>
-          <w:szCs w:val="25"/>
-        </w:rPr>
-        <w:t>danh</w:t>
-      </w:r>
-      <w:proofErr w:type="spellEnd"/>
-      <w:r>
-        <w:rPr>
-          <w:rFonts w:ascii="Times New Roman" w:eastAsia="Times New Roman" w:hAnsi="Times New Roman"/>
-          <w:color w:val="000000"/>
-          <w:spacing w:val="-4"/>
-          <w:sz w:val="25"/>
-          <w:szCs w:val="25"/>
-        </w:rPr>
-        <w:t xml:space="preserve"> </w:t>
-      </w:r>
-      <w:proofErr w:type="spellStart"/>
-      <w:r>
-        <w:rPr>
-          <w:rFonts w:ascii="Times New Roman" w:eastAsia="Times New Roman" w:hAnsi="Times New Roman"/>
-          <w:color w:val="000000"/>
-          <w:spacing w:val="-4"/>
-          <w:sz w:val="25"/>
-          <w:szCs w:val="25"/>
-        </w:rPr>
-        <w:t>quốc</w:t>
-      </w:r>
-      <w:proofErr w:type="spellEnd"/>
-      <w:r>
-        <w:rPr>
-          <w:rFonts w:ascii="Times New Roman" w:eastAsia="Times New Roman" w:hAnsi="Times New Roman"/>
-          <w:color w:val="000000"/>
-          <w:spacing w:val="-4"/>
-          <w:sz w:val="25"/>
-          <w:szCs w:val="25"/>
-        </w:rPr>
-        <w:t xml:space="preserve"> </w:t>
-      </w:r>
-      <w:proofErr w:type="spellStart"/>
-      <w:r>
-        <w:rPr>
-          <w:rFonts w:ascii="Times New Roman" w:eastAsia="Times New Roman" w:hAnsi="Times New Roman"/>
-          <w:color w:val="000000"/>
-          <w:spacing w:val="-4"/>
-          <w:sz w:val="25"/>
-          <w:szCs w:val="25"/>
-        </w:rPr>
-        <w:t>gia</w:t>
-      </w:r>
-      <w:proofErr w:type="spellEnd"/>
+        <w:t>định danh quốc gia</w:t>
+      </w:r>
       <w:r>
         <w:rPr>
           <w:rFonts w:ascii="Times New Roman" w:eastAsia="Times New Roman" w:hAnsi="Times New Roman"/>
@@ -6276,307 +4804,7 @@
           <w:sz w:val="25"/>
           <w:szCs w:val="25"/>
         </w:rPr>
-        <w:t xml:space="preserve"> </w:t>
-      </w:r>
-      <w:proofErr w:type="spellStart"/>
-      <w:r>
-        <w:rPr>
-          <w:rFonts w:ascii="Times New Roman" w:eastAsia="Times New Roman" w:hAnsi="Times New Roman"/>
-          <w:color w:val="000000"/>
-          <w:sz w:val="25"/>
-          <w:szCs w:val="25"/>
-        </w:rPr>
-        <w:t>trừ</w:t>
-      </w:r>
-      <w:proofErr w:type="spellEnd"/>
-      <w:r>
-        <w:rPr>
-          <w:rFonts w:ascii="Times New Roman" w:eastAsia="Times New Roman" w:hAnsi="Times New Roman"/>
-          <w:color w:val="000000"/>
-          <w:sz w:val="25"/>
-          <w:szCs w:val="25"/>
-        </w:rPr>
-        <w:t xml:space="preserve"> </w:t>
-      </w:r>
-      <w:proofErr w:type="spellStart"/>
-      <w:r>
-        <w:rPr>
-          <w:rFonts w:ascii="Times New Roman" w:eastAsia="Times New Roman" w:hAnsi="Times New Roman"/>
-          <w:color w:val="000000"/>
-          <w:sz w:val="25"/>
-          <w:szCs w:val="25"/>
-        </w:rPr>
-        <w:t>trường</w:t>
-      </w:r>
-      <w:proofErr w:type="spellEnd"/>
-      <w:r>
-        <w:rPr>
-          <w:rFonts w:ascii="Times New Roman" w:eastAsia="Times New Roman" w:hAnsi="Times New Roman"/>
-          <w:color w:val="000000"/>
-          <w:sz w:val="25"/>
-          <w:szCs w:val="25"/>
-        </w:rPr>
-        <w:t xml:space="preserve"> </w:t>
-      </w:r>
-      <w:proofErr w:type="spellStart"/>
-      <w:r>
-        <w:rPr>
-          <w:rFonts w:ascii="Times New Roman" w:eastAsia="Times New Roman" w:hAnsi="Times New Roman"/>
-          <w:color w:val="000000"/>
-          <w:sz w:val="25"/>
-          <w:szCs w:val="25"/>
-        </w:rPr>
-        <w:t>hợp</w:t>
-      </w:r>
-      <w:proofErr w:type="spellEnd"/>
-      <w:r>
-        <w:rPr>
-          <w:rFonts w:ascii="Times New Roman" w:eastAsia="Times New Roman" w:hAnsi="Times New Roman"/>
-          <w:color w:val="000000"/>
-          <w:sz w:val="25"/>
-          <w:szCs w:val="25"/>
-        </w:rPr>
-        <w:t xml:space="preserve"> </w:t>
-      </w:r>
-      <w:proofErr w:type="spellStart"/>
-      <w:r>
-        <w:rPr>
-          <w:rFonts w:ascii="Times New Roman" w:eastAsia="Times New Roman" w:hAnsi="Times New Roman"/>
-          <w:color w:val="000000"/>
-          <w:sz w:val="25"/>
-          <w:szCs w:val="25"/>
-        </w:rPr>
-        <w:t>đã</w:t>
-      </w:r>
-      <w:proofErr w:type="spellEnd"/>
-      <w:r>
-        <w:rPr>
-          <w:rFonts w:ascii="Times New Roman" w:eastAsia="Times New Roman" w:hAnsi="Times New Roman"/>
-          <w:color w:val="000000"/>
-          <w:sz w:val="25"/>
-          <w:szCs w:val="25"/>
-        </w:rPr>
-        <w:t xml:space="preserve"> </w:t>
-      </w:r>
-      <w:proofErr w:type="spellStart"/>
-      <w:r>
-        <w:rPr>
-          <w:rFonts w:ascii="Times New Roman" w:eastAsia="Times New Roman" w:hAnsi="Times New Roman"/>
-          <w:color w:val="000000"/>
-          <w:sz w:val="25"/>
-          <w:szCs w:val="25"/>
-        </w:rPr>
-        <w:t>có</w:t>
-      </w:r>
-      <w:proofErr w:type="spellEnd"/>
-      <w:r>
-        <w:rPr>
-          <w:rFonts w:ascii="Times New Roman" w:eastAsia="Times New Roman" w:hAnsi="Times New Roman"/>
-          <w:color w:val="000000"/>
-          <w:sz w:val="25"/>
-          <w:szCs w:val="25"/>
-        </w:rPr>
-        <w:t xml:space="preserve"> </w:t>
-      </w:r>
-      <w:proofErr w:type="spellStart"/>
-      <w:r>
-        <w:rPr>
-          <w:rFonts w:ascii="Times New Roman" w:eastAsia="Times New Roman" w:hAnsi="Times New Roman"/>
-          <w:color w:val="000000"/>
-          <w:sz w:val="25"/>
-          <w:szCs w:val="25"/>
-        </w:rPr>
-        <w:t>thỏa</w:t>
-      </w:r>
-      <w:proofErr w:type="spellEnd"/>
-      <w:r>
-        <w:rPr>
-          <w:rFonts w:ascii="Times New Roman" w:eastAsia="Times New Roman" w:hAnsi="Times New Roman"/>
-          <w:color w:val="000000"/>
-          <w:sz w:val="25"/>
-          <w:szCs w:val="25"/>
-        </w:rPr>
-        <w:t xml:space="preserve"> </w:t>
-      </w:r>
-      <w:proofErr w:type="spellStart"/>
-      <w:r>
-        <w:rPr>
-          <w:rFonts w:ascii="Times New Roman" w:eastAsia="Times New Roman" w:hAnsi="Times New Roman"/>
-          <w:color w:val="000000"/>
-          <w:sz w:val="25"/>
-          <w:szCs w:val="25"/>
-        </w:rPr>
-        <w:t>thuận</w:t>
-      </w:r>
-      <w:proofErr w:type="spellEnd"/>
-      <w:r>
-        <w:rPr>
-          <w:rFonts w:ascii="Times New Roman" w:eastAsia="Times New Roman" w:hAnsi="Times New Roman"/>
-          <w:color w:val="000000"/>
-          <w:sz w:val="25"/>
-          <w:szCs w:val="25"/>
-        </w:rPr>
-        <w:t xml:space="preserve"> </w:t>
-      </w:r>
-      <w:proofErr w:type="spellStart"/>
-      <w:r>
-        <w:rPr>
-          <w:rFonts w:ascii="Times New Roman" w:eastAsia="Times New Roman" w:hAnsi="Times New Roman"/>
-          <w:color w:val="000000"/>
-          <w:sz w:val="25"/>
-          <w:szCs w:val="25"/>
-        </w:rPr>
-        <w:t>về</w:t>
-      </w:r>
-      <w:proofErr w:type="spellEnd"/>
-      <w:r>
-        <w:rPr>
-          <w:rFonts w:ascii="Times New Roman" w:eastAsia="Times New Roman" w:hAnsi="Times New Roman"/>
-          <w:color w:val="000000"/>
-          <w:sz w:val="25"/>
-          <w:szCs w:val="25"/>
-        </w:rPr>
-        <w:t xml:space="preserve"> </w:t>
-      </w:r>
-      <w:proofErr w:type="spellStart"/>
-      <w:r>
-        <w:rPr>
-          <w:rFonts w:ascii="Times New Roman" w:eastAsia="Times New Roman" w:hAnsi="Times New Roman"/>
-          <w:color w:val="000000"/>
-          <w:sz w:val="25"/>
-          <w:szCs w:val="25"/>
-        </w:rPr>
-        <w:t>việc</w:t>
-      </w:r>
-      <w:proofErr w:type="spellEnd"/>
-      <w:r>
-        <w:rPr>
-          <w:rFonts w:ascii="Times New Roman" w:eastAsia="Times New Roman" w:hAnsi="Times New Roman"/>
-          <w:color w:val="000000"/>
-          <w:sz w:val="25"/>
-          <w:szCs w:val="25"/>
-        </w:rPr>
-        <w:t xml:space="preserve"> </w:t>
-      </w:r>
-      <w:proofErr w:type="spellStart"/>
-      <w:r>
-        <w:rPr>
-          <w:rFonts w:ascii="Times New Roman" w:eastAsia="Times New Roman" w:hAnsi="Times New Roman"/>
-          <w:color w:val="000000"/>
-          <w:sz w:val="25"/>
-          <w:szCs w:val="25"/>
-        </w:rPr>
-        <w:t>cử</w:t>
-      </w:r>
-      <w:proofErr w:type="spellEnd"/>
-      <w:r>
-        <w:rPr>
-          <w:rFonts w:ascii="Times New Roman" w:eastAsia="Times New Roman" w:hAnsi="Times New Roman"/>
-          <w:color w:val="000000"/>
-          <w:sz w:val="25"/>
-          <w:szCs w:val="25"/>
-        </w:rPr>
-        <w:t xml:space="preserve"> </w:t>
-      </w:r>
-      <w:proofErr w:type="spellStart"/>
-      <w:r>
-        <w:rPr>
-          <w:rFonts w:ascii="Times New Roman" w:eastAsia="Times New Roman" w:hAnsi="Times New Roman"/>
-          <w:color w:val="000000"/>
-          <w:sz w:val="25"/>
-          <w:szCs w:val="25"/>
-        </w:rPr>
-        <w:t>đại</w:t>
-      </w:r>
-      <w:proofErr w:type="spellEnd"/>
-      <w:r>
-        <w:rPr>
-          <w:rFonts w:ascii="Times New Roman" w:eastAsia="Times New Roman" w:hAnsi="Times New Roman"/>
-          <w:color w:val="000000"/>
-          <w:sz w:val="25"/>
-          <w:szCs w:val="25"/>
-        </w:rPr>
-        <w:t xml:space="preserve"> </w:t>
-      </w:r>
-      <w:proofErr w:type="spellStart"/>
-      <w:r>
-        <w:rPr>
-          <w:rFonts w:ascii="Times New Roman" w:eastAsia="Times New Roman" w:hAnsi="Times New Roman"/>
-          <w:color w:val="000000"/>
-          <w:sz w:val="25"/>
-          <w:szCs w:val="25"/>
-        </w:rPr>
-        <w:t>diện</w:t>
-      </w:r>
-      <w:proofErr w:type="spellEnd"/>
-      <w:r>
-        <w:rPr>
-          <w:rFonts w:ascii="Times New Roman" w:eastAsia="Times New Roman" w:hAnsi="Times New Roman"/>
-          <w:color w:val="000000"/>
-          <w:sz w:val="25"/>
-          <w:szCs w:val="25"/>
-        </w:rPr>
-        <w:t xml:space="preserve"> </w:t>
-      </w:r>
-      <w:proofErr w:type="spellStart"/>
-      <w:r>
-        <w:rPr>
-          <w:rFonts w:ascii="Times New Roman" w:eastAsia="Times New Roman" w:hAnsi="Times New Roman"/>
-          <w:color w:val="000000"/>
-          <w:sz w:val="25"/>
-          <w:szCs w:val="25"/>
-        </w:rPr>
-        <w:t>có</w:t>
-      </w:r>
-      <w:proofErr w:type="spellEnd"/>
-      <w:r>
-        <w:rPr>
-          <w:rFonts w:ascii="Times New Roman" w:eastAsia="Times New Roman" w:hAnsi="Times New Roman"/>
-          <w:color w:val="000000"/>
-          <w:sz w:val="25"/>
-          <w:szCs w:val="25"/>
-        </w:rPr>
-        <w:t xml:space="preserve"> ý </w:t>
-      </w:r>
-      <w:proofErr w:type="spellStart"/>
-      <w:r>
-        <w:rPr>
-          <w:rFonts w:ascii="Times New Roman" w:eastAsia="Times New Roman" w:hAnsi="Times New Roman"/>
-          <w:color w:val="000000"/>
-          <w:sz w:val="25"/>
-          <w:szCs w:val="25"/>
-        </w:rPr>
-        <w:t>kiến</w:t>
-      </w:r>
-      <w:proofErr w:type="spellEnd"/>
-      <w:r>
-        <w:rPr>
-          <w:rFonts w:ascii="Times New Roman" w:eastAsia="Times New Roman" w:hAnsi="Times New Roman"/>
-          <w:color w:val="000000"/>
-          <w:sz w:val="25"/>
-          <w:szCs w:val="25"/>
-        </w:rPr>
-        <w:t xml:space="preserve"> </w:t>
-      </w:r>
-      <w:proofErr w:type="spellStart"/>
-      <w:r>
-        <w:rPr>
-          <w:rFonts w:ascii="Times New Roman" w:eastAsia="Times New Roman" w:hAnsi="Times New Roman"/>
-          <w:color w:val="000000"/>
-          <w:sz w:val="25"/>
-          <w:szCs w:val="25"/>
-        </w:rPr>
-        <w:t>đồng</w:t>
-      </w:r>
-      <w:proofErr w:type="spellEnd"/>
-      <w:r>
-        <w:rPr>
-          <w:rFonts w:ascii="Times New Roman" w:eastAsia="Times New Roman" w:hAnsi="Times New Roman"/>
-          <w:color w:val="000000"/>
-          <w:sz w:val="25"/>
-          <w:szCs w:val="25"/>
-        </w:rPr>
-        <w:t xml:space="preserve"> ý</w:t>
+        <w:t xml:space="preserve"> trừ trường hợp đã có thỏa thuận về việc cử đại diện có ý kiến đồng ý</w:t>
       </w:r>
       <w:r>
         <w:rPr>
@@ -6588,7 +4816,6 @@
         </w:rPr>
         <w:t xml:space="preserve">; Trường hợp chủ sở hữu chỗ ở hợp pháp xác nhận nội dung đồng ý thông qua ứng dụng </w:t>
       </w:r>
-      <w:proofErr w:type="spellStart"/>
       <w:r>
         <w:rPr>
           <w:rFonts w:ascii="Times New Roman" w:eastAsia="Times New Roman" w:hAnsi="Times New Roman"/>
@@ -6597,75 +4824,8 @@
           <w:sz w:val="25"/>
           <w:szCs w:val="25"/>
         </w:rPr>
-        <w:t>định</w:t>
-      </w:r>
-      <w:proofErr w:type="spellEnd"/>
-      <w:r>
-        <w:rPr>
-          <w:rFonts w:ascii="Times New Roman" w:eastAsia="Times New Roman" w:hAnsi="Times New Roman"/>
-          <w:color w:val="000000"/>
-          <w:spacing w:val="-4"/>
-          <w:sz w:val="25"/>
-          <w:szCs w:val="25"/>
-        </w:rPr>
-        <w:t xml:space="preserve"> </w:t>
-      </w:r>
-      <w:proofErr w:type="spellStart"/>
-      <w:r>
-        <w:rPr>
-          <w:rFonts w:ascii="Times New Roman" w:eastAsia="Times New Roman" w:hAnsi="Times New Roman"/>
-          <w:color w:val="000000"/>
-          <w:spacing w:val="-4"/>
-          <w:sz w:val="25"/>
-          <w:szCs w:val="25"/>
-        </w:rPr>
-        <w:t>danh</w:t>
-      </w:r>
-      <w:proofErr w:type="spellEnd"/>
-      <w:r>
-        <w:rPr>
-          <w:rFonts w:ascii="Times New Roman" w:eastAsia="Times New Roman" w:hAnsi="Times New Roman"/>
-          <w:color w:val="000000"/>
-          <w:spacing w:val="-4"/>
-          <w:sz w:val="25"/>
-          <w:szCs w:val="25"/>
-        </w:rPr>
-        <w:t xml:space="preserve"> </w:t>
-      </w:r>
-      <w:proofErr w:type="spellStart"/>
-      <w:r>
-        <w:rPr>
-          <w:rFonts w:ascii="Times New Roman" w:eastAsia="Times New Roman" w:hAnsi="Times New Roman"/>
-          <w:color w:val="000000"/>
-          <w:spacing w:val="-4"/>
-          <w:sz w:val="25"/>
-          <w:szCs w:val="25"/>
-        </w:rPr>
-        <w:t>quốc</w:t>
-      </w:r>
-      <w:proofErr w:type="spellEnd"/>
-      <w:r>
-        <w:rPr>
-          <w:rFonts w:ascii="Times New Roman" w:eastAsia="Times New Roman" w:hAnsi="Times New Roman"/>
-          <w:color w:val="000000"/>
-          <w:spacing w:val="-4"/>
-          <w:sz w:val="25"/>
-          <w:szCs w:val="25"/>
-        </w:rPr>
-        <w:t xml:space="preserve"> </w:t>
-      </w:r>
-      <w:proofErr w:type="spellStart"/>
-      <w:r>
-        <w:rPr>
-          <w:rFonts w:ascii="Times New Roman" w:eastAsia="Times New Roman" w:hAnsi="Times New Roman"/>
-          <w:color w:val="000000"/>
-          <w:spacing w:val="-4"/>
-          <w:sz w:val="25"/>
-          <w:szCs w:val="25"/>
-        </w:rPr>
-        <w:t>gia</w:t>
-      </w:r>
-      <w:proofErr w:type="spellEnd"/>
+        <w:t>định danh quốc gia</w:t>
+      </w:r>
       <w:r>
         <w:rPr>
           <w:rFonts w:ascii="Times New Roman" w:eastAsia="Times New Roman" w:hAnsi="Times New Roman"/>
@@ -6770,7 +4930,6 @@
         </w:rPr>
         <w:t xml:space="preserve">b) Cha, mẹ hoặc người giám hộ xác nhận nội dung đồng ý thông qua ứng dụng </w:t>
       </w:r>
-      <w:proofErr w:type="spellStart"/>
       <w:r>
         <w:rPr>
           <w:rFonts w:ascii="Times New Roman" w:eastAsia="Times New Roman" w:hAnsi="Times New Roman"/>
@@ -6779,75 +4938,8 @@
           <w:sz w:val="25"/>
           <w:szCs w:val="25"/>
         </w:rPr>
-        <w:t>định</w:t>
-      </w:r>
-      <w:proofErr w:type="spellEnd"/>
-      <w:r>
-        <w:rPr>
-          <w:rFonts w:ascii="Times New Roman" w:eastAsia="Times New Roman" w:hAnsi="Times New Roman"/>
-          <w:color w:val="000000"/>
-          <w:spacing w:val="-4"/>
-          <w:sz w:val="25"/>
-          <w:szCs w:val="25"/>
-        </w:rPr>
-        <w:t xml:space="preserve"> </w:t>
-      </w:r>
-      <w:proofErr w:type="spellStart"/>
-      <w:r>
-        <w:rPr>
-          <w:rFonts w:ascii="Times New Roman" w:eastAsia="Times New Roman" w:hAnsi="Times New Roman"/>
-          <w:color w:val="000000"/>
-          <w:spacing w:val="-4"/>
-          <w:sz w:val="25"/>
-          <w:szCs w:val="25"/>
-        </w:rPr>
-        <w:t>danh</w:t>
-      </w:r>
-      <w:proofErr w:type="spellEnd"/>
-      <w:r>
-        <w:rPr>
-          <w:rFonts w:ascii="Times New Roman" w:eastAsia="Times New Roman" w:hAnsi="Times New Roman"/>
-          <w:color w:val="000000"/>
-          <w:spacing w:val="-4"/>
-          <w:sz w:val="25"/>
-          <w:szCs w:val="25"/>
-        </w:rPr>
-        <w:t xml:space="preserve"> </w:t>
-      </w:r>
-      <w:proofErr w:type="spellStart"/>
-      <w:r>
-        <w:rPr>
-          <w:rFonts w:ascii="Times New Roman" w:eastAsia="Times New Roman" w:hAnsi="Times New Roman"/>
-          <w:color w:val="000000"/>
-          <w:spacing w:val="-4"/>
-          <w:sz w:val="25"/>
-          <w:szCs w:val="25"/>
-        </w:rPr>
-        <w:t>quốc</w:t>
-      </w:r>
-      <w:proofErr w:type="spellEnd"/>
-      <w:r>
-        <w:rPr>
-          <w:rFonts w:ascii="Times New Roman" w:eastAsia="Times New Roman" w:hAnsi="Times New Roman"/>
-          <w:color w:val="000000"/>
-          <w:spacing w:val="-4"/>
-          <w:sz w:val="25"/>
-          <w:szCs w:val="25"/>
-        </w:rPr>
-        <w:t xml:space="preserve"> </w:t>
-      </w:r>
-      <w:proofErr w:type="spellStart"/>
-      <w:r>
-        <w:rPr>
-          <w:rFonts w:ascii="Times New Roman" w:eastAsia="Times New Roman" w:hAnsi="Times New Roman"/>
-          <w:color w:val="000000"/>
-          <w:spacing w:val="-4"/>
-          <w:sz w:val="25"/>
-          <w:szCs w:val="25"/>
-        </w:rPr>
-        <w:t>gia</w:t>
-      </w:r>
-      <w:proofErr w:type="spellEnd"/>
+        <w:t>định danh quốc gia</w:t>
+      </w:r>
       <w:r>
         <w:rPr>
           <w:rFonts w:ascii="Times New Roman" w:eastAsia="Times New Roman" w:hAnsi="Times New Roman"/>
@@ -6926,9 +5018,8 @@
           <w:sz w:val="25"/>
           <w:szCs w:val="25"/>
         </w:rPr>
-        <w:t xml:space="preserve">Trường </w:t>
-      </w:r>
-      <w:proofErr w:type="spellStart"/>
+        <w:t>Trường hợp nộp trực tiếp n</w:t>
+      </w:r>
       <w:r>
         <w:rPr>
           <w:rFonts w:ascii="Times New Roman" w:eastAsia="Times New Roman" w:hAnsi="Times New Roman"/>
@@ -6936,10 +5027,10 @@
           <w:spacing w:val="-10"/>
           <w:sz w:val="25"/>
           <w:szCs w:val="25"/>
-        </w:rPr>
-        <w:t>hợp</w:t>
-      </w:r>
-      <w:proofErr w:type="spellEnd"/>
+          <w:lang w:val="vi-VN"/>
+        </w:rPr>
+        <w:t>gười kê khai ký, ghi rõ họ, chữ đệm và tên vào Tờ khai</w:t>
+      </w:r>
       <w:r>
         <w:rPr>
           <w:rFonts w:ascii="Times New Roman" w:eastAsia="Times New Roman" w:hAnsi="Times New Roman"/>
@@ -6948,1462 +5039,59 @@
           <w:sz w:val="25"/>
           <w:szCs w:val="25"/>
         </w:rPr>
+        <w:t xml:space="preserve">; Trường hợp nộp qua cổng dịch vụ công hoặc ứng dụng </w:t>
+      </w:r>
+      <w:r>
+        <w:rPr>
+          <w:rFonts w:ascii="Times New Roman" w:eastAsia="Times New Roman" w:hAnsi="Times New Roman"/>
+          <w:color w:val="000000"/>
+          <w:spacing w:val="-4"/>
+          <w:sz w:val="25"/>
+          <w:szCs w:val="25"/>
+        </w:rPr>
+        <w:t>định danh quốc gia</w:t>
+      </w:r>
+      <w:r>
+        <w:rPr>
+          <w:rFonts w:ascii="Times New Roman" w:eastAsia="Times New Roman" w:hAnsi="Times New Roman"/>
+          <w:color w:val="000000"/>
+          <w:spacing w:val="-10"/>
+          <w:sz w:val="25"/>
+          <w:szCs w:val="25"/>
+        </w:rPr>
+        <w:t xml:space="preserve"> thì người kê khai không phải ký vào mục này</w:t>
+      </w:r>
+      <w:r>
+        <w:rPr>
+          <w:rFonts w:ascii="Times New Roman" w:eastAsia="Times New Roman" w:hAnsi="Times New Roman"/>
+          <w:color w:val="000000"/>
+          <w:spacing w:val="-10"/>
+          <w:sz w:val="25"/>
+          <w:szCs w:val="25"/>
+          <w:lang w:val="vi-VN"/>
+        </w:rPr>
+        <w:t>.</w:t>
+      </w:r>
+      <w:r>
+        <w:rPr>
+          <w:rFonts w:ascii="Times New Roman" w:eastAsia="Times New Roman" w:hAnsi="Times New Roman"/>
+          <w:color w:val="000000"/>
+          <w:spacing w:val="-10"/>
+          <w:sz w:val="25"/>
+          <w:szCs w:val="25"/>
+        </w:rPr>
         <w:t xml:space="preserve"> </w:t>
       </w:r>
-      <w:proofErr w:type="spellStart"/>
-      <w:r>
-        <w:rPr>
-          <w:rFonts w:ascii="Times New Roman" w:eastAsia="Times New Roman" w:hAnsi="Times New Roman"/>
+      <w:r>
+        <w:rPr>
+          <w:rFonts w:ascii="Times New Roman" w:eastAsia="Times New Roman" w:hAnsi="Times New Roman"/>
+          <w:i/>
           <w:color w:val="000000"/>
           <w:spacing w:val="-10"/>
           <w:sz w:val="25"/>
           <w:szCs w:val="25"/>
         </w:rPr>
-        <w:t>nộp</w:t>
-      </w:r>
-      <w:proofErr w:type="spellEnd"/>
-      <w:r>
-        <w:rPr>
-          <w:rFonts w:ascii="Times New Roman" w:eastAsia="Times New Roman" w:hAnsi="Times New Roman"/>
-          <w:color w:val="000000"/>
-          <w:spacing w:val="-10"/>
-          <w:sz w:val="25"/>
-          <w:szCs w:val="25"/>
-        </w:rPr>
-        <w:t xml:space="preserve"> </w:t>
-      </w:r>
-      <w:proofErr w:type="spellStart"/>
-      <w:r>
-        <w:rPr>
-          <w:rFonts w:ascii="Times New Roman" w:eastAsia="Times New Roman" w:hAnsi="Times New Roman"/>
-          <w:color w:val="000000"/>
-          <w:spacing w:val="-10"/>
-          <w:sz w:val="25"/>
-          <w:szCs w:val="25"/>
-        </w:rPr>
-        <w:t>trực</w:t>
-      </w:r>
-      <w:proofErr w:type="spellEnd"/>
-      <w:r>
-        <w:rPr>
-          <w:rFonts w:ascii="Times New Roman" w:eastAsia="Times New Roman" w:hAnsi="Times New Roman"/>
-          <w:color w:val="000000"/>
-          <w:spacing w:val="-10"/>
-          <w:sz w:val="25"/>
-          <w:szCs w:val="25"/>
-        </w:rPr>
-        <w:t xml:space="preserve"> </w:t>
-      </w:r>
-      <w:proofErr w:type="spellStart"/>
-      <w:r>
-        <w:rPr>
-          <w:rFonts w:ascii="Times New Roman" w:eastAsia="Times New Roman" w:hAnsi="Times New Roman"/>
-          <w:color w:val="000000"/>
-          <w:spacing w:val="-10"/>
-          <w:sz w:val="25"/>
-          <w:szCs w:val="25"/>
-        </w:rPr>
-        <w:t>tiếp</w:t>
-      </w:r>
-      <w:proofErr w:type="spellEnd"/>
-      <w:r>
-        <w:rPr>
-          <w:rFonts w:ascii="Times New Roman" w:eastAsia="Times New Roman" w:hAnsi="Times New Roman"/>
-          <w:color w:val="000000"/>
-          <w:spacing w:val="-10"/>
-          <w:sz w:val="25"/>
-          <w:szCs w:val="25"/>
-        </w:rPr>
-        <w:t xml:space="preserve"> n</w:t>
-      </w:r>
-      <w:r>
-        <w:rPr>
-          <w:rFonts w:ascii="Times New Roman" w:eastAsia="Times New Roman" w:hAnsi="Times New Roman"/>
-          <w:color w:val="000000"/>
-          <w:spacing w:val="-10"/>
-          <w:sz w:val="25"/>
-          <w:szCs w:val="25"/>
-          <w:lang w:val="vi-VN"/>
-        </w:rPr>
-        <w:t>gười kê khai ký, ghi rõ họ, chữ đệm và tên vào Tờ khai</w:t>
-      </w:r>
-      <w:r>
-        <w:rPr>
-          <w:rFonts w:ascii="Times New Roman" w:eastAsia="Times New Roman" w:hAnsi="Times New Roman"/>
-          <w:color w:val="000000"/>
-          <w:spacing w:val="-10"/>
-          <w:sz w:val="25"/>
-          <w:szCs w:val="25"/>
-        </w:rPr>
-        <w:t xml:space="preserve">; Trường </w:t>
-      </w:r>
-      <w:proofErr w:type="spellStart"/>
-      <w:r>
-        <w:rPr>
-          <w:rFonts w:ascii="Times New Roman" w:eastAsia="Times New Roman" w:hAnsi="Times New Roman"/>
-          <w:color w:val="000000"/>
-          <w:spacing w:val="-10"/>
-          <w:sz w:val="25"/>
-          <w:szCs w:val="25"/>
-        </w:rPr>
-        <w:t>hợp</w:t>
-      </w:r>
-      <w:proofErr w:type="spellEnd"/>
-      <w:r>
-        <w:rPr>
-          <w:rFonts w:ascii="Times New Roman" w:eastAsia="Times New Roman" w:hAnsi="Times New Roman"/>
-          <w:color w:val="000000"/>
-          <w:spacing w:val="-10"/>
-          <w:sz w:val="25"/>
-          <w:szCs w:val="25"/>
-        </w:rPr>
-        <w:t xml:space="preserve"> </w:t>
-      </w:r>
-      <w:proofErr w:type="spellStart"/>
-      <w:r>
-        <w:rPr>
-          <w:rFonts w:ascii="Times New Roman" w:eastAsia="Times New Roman" w:hAnsi="Times New Roman"/>
-          <w:color w:val="000000"/>
-          <w:spacing w:val="-10"/>
-          <w:sz w:val="25"/>
-          <w:szCs w:val="25"/>
-        </w:rPr>
-        <w:t>nộp</w:t>
-      </w:r>
-      <w:proofErr w:type="spellEnd"/>
-      <w:r>
-        <w:rPr>
-          <w:rFonts w:ascii="Times New Roman" w:eastAsia="Times New Roman" w:hAnsi="Times New Roman"/>
-          <w:color w:val="000000"/>
-          <w:spacing w:val="-10"/>
-          <w:sz w:val="25"/>
-          <w:szCs w:val="25"/>
-        </w:rPr>
-        <w:t xml:space="preserve"> qua </w:t>
-      </w:r>
-      <w:proofErr w:type="spellStart"/>
-      <w:r>
-        <w:rPr>
-          <w:rFonts w:ascii="Times New Roman" w:eastAsia="Times New Roman" w:hAnsi="Times New Roman"/>
-          <w:color w:val="000000"/>
-          <w:spacing w:val="-10"/>
-          <w:sz w:val="25"/>
-          <w:szCs w:val="25"/>
-        </w:rPr>
-        <w:t>cổng</w:t>
-      </w:r>
-      <w:proofErr w:type="spellEnd"/>
-      <w:r>
-        <w:rPr>
-          <w:rFonts w:ascii="Times New Roman" w:eastAsia="Times New Roman" w:hAnsi="Times New Roman"/>
-          <w:color w:val="000000"/>
-          <w:spacing w:val="-10"/>
-          <w:sz w:val="25"/>
-          <w:szCs w:val="25"/>
-        </w:rPr>
-        <w:t xml:space="preserve"> </w:t>
-      </w:r>
-      <w:proofErr w:type="spellStart"/>
-      <w:r>
-        <w:rPr>
-          <w:rFonts w:ascii="Times New Roman" w:eastAsia="Times New Roman" w:hAnsi="Times New Roman"/>
-          <w:color w:val="000000"/>
-          <w:spacing w:val="-10"/>
-          <w:sz w:val="25"/>
-          <w:szCs w:val="25"/>
-        </w:rPr>
-        <w:t>dịch</w:t>
-      </w:r>
-      <w:proofErr w:type="spellEnd"/>
-      <w:r>
-        <w:rPr>
-          <w:rFonts w:ascii="Times New Roman" w:eastAsia="Times New Roman" w:hAnsi="Times New Roman"/>
-          <w:color w:val="000000"/>
-          <w:spacing w:val="-10"/>
-          <w:sz w:val="25"/>
-          <w:szCs w:val="25"/>
-        </w:rPr>
-        <w:t xml:space="preserve"> </w:t>
-      </w:r>
-      <w:proofErr w:type="spellStart"/>
-      <w:r>
-        <w:rPr>
-          <w:rFonts w:ascii="Times New Roman" w:eastAsia="Times New Roman" w:hAnsi="Times New Roman"/>
-          <w:color w:val="000000"/>
-          <w:spacing w:val="-10"/>
-          <w:sz w:val="25"/>
-          <w:szCs w:val="25"/>
-        </w:rPr>
-        <w:t>vụ</w:t>
-      </w:r>
-      <w:proofErr w:type="spellEnd"/>
-      <w:r>
-        <w:rPr>
-          <w:rFonts w:ascii="Times New Roman" w:eastAsia="Times New Roman" w:hAnsi="Times New Roman"/>
-          <w:color w:val="000000"/>
-          <w:spacing w:val="-10"/>
-          <w:sz w:val="25"/>
-          <w:szCs w:val="25"/>
-        </w:rPr>
-        <w:t xml:space="preserve"> </w:t>
-      </w:r>
-      <w:proofErr w:type="spellStart"/>
-      <w:r>
-        <w:rPr>
-          <w:rFonts w:ascii="Times New Roman" w:eastAsia="Times New Roman" w:hAnsi="Times New Roman"/>
-          <w:color w:val="000000"/>
-          <w:spacing w:val="-10"/>
-          <w:sz w:val="25"/>
-          <w:szCs w:val="25"/>
-        </w:rPr>
-        <w:t>công</w:t>
-      </w:r>
-      <w:proofErr w:type="spellEnd"/>
-      <w:r>
-        <w:rPr>
-          <w:rFonts w:ascii="Times New Roman" w:eastAsia="Times New Roman" w:hAnsi="Times New Roman"/>
-          <w:color w:val="000000"/>
-          <w:spacing w:val="-10"/>
-          <w:sz w:val="25"/>
-          <w:szCs w:val="25"/>
-        </w:rPr>
-        <w:t xml:space="preserve"> </w:t>
-      </w:r>
-      <w:proofErr w:type="spellStart"/>
-      <w:r>
-        <w:rPr>
-          <w:rFonts w:ascii="Times New Roman" w:eastAsia="Times New Roman" w:hAnsi="Times New Roman"/>
-          <w:color w:val="000000"/>
-          <w:spacing w:val="-10"/>
-          <w:sz w:val="25"/>
-          <w:szCs w:val="25"/>
-        </w:rPr>
-        <w:t>hoặc</w:t>
-      </w:r>
-      <w:proofErr w:type="spellEnd"/>
-      <w:r>
-        <w:rPr>
-          <w:rFonts w:ascii="Times New Roman" w:eastAsia="Times New Roman" w:hAnsi="Times New Roman"/>
-          <w:color w:val="000000"/>
-          <w:spacing w:val="-10"/>
-          <w:sz w:val="25"/>
-          <w:szCs w:val="25"/>
-        </w:rPr>
-        <w:t xml:space="preserve"> </w:t>
-      </w:r>
-      <w:proofErr w:type="spellStart"/>
-      <w:r>
-        <w:rPr>
-          <w:rFonts w:ascii="Times New Roman" w:eastAsia="Times New Roman" w:hAnsi="Times New Roman"/>
-          <w:color w:val="000000"/>
-          <w:spacing w:val="-10"/>
-          <w:sz w:val="25"/>
-          <w:szCs w:val="25"/>
-        </w:rPr>
-        <w:t>ứng</w:t>
-      </w:r>
-      <w:proofErr w:type="spellEnd"/>
-      <w:r>
-        <w:rPr>
-          <w:rFonts w:ascii="Times New Roman" w:eastAsia="Times New Roman" w:hAnsi="Times New Roman"/>
-          <w:color w:val="000000"/>
-          <w:spacing w:val="-10"/>
-          <w:sz w:val="25"/>
-          <w:szCs w:val="25"/>
-        </w:rPr>
-        <w:t xml:space="preserve"> </w:t>
-      </w:r>
-      <w:proofErr w:type="spellStart"/>
-      <w:r>
-        <w:rPr>
-          <w:rFonts w:ascii="Times New Roman" w:eastAsia="Times New Roman" w:hAnsi="Times New Roman"/>
-          <w:color w:val="000000"/>
-          <w:spacing w:val="-10"/>
-          <w:sz w:val="25"/>
-          <w:szCs w:val="25"/>
-        </w:rPr>
-        <w:t>dụng</w:t>
-      </w:r>
-      <w:proofErr w:type="spellEnd"/>
-      <w:r>
-        <w:rPr>
-          <w:rFonts w:ascii="Times New Roman" w:eastAsia="Times New Roman" w:hAnsi="Times New Roman"/>
-          <w:color w:val="000000"/>
-          <w:spacing w:val="-10"/>
-          <w:sz w:val="25"/>
-          <w:szCs w:val="25"/>
-        </w:rPr>
-        <w:t xml:space="preserve"> </w:t>
-      </w:r>
-      <w:proofErr w:type="spellStart"/>
-      <w:r>
-        <w:rPr>
-          <w:rFonts w:ascii="Times New Roman" w:eastAsia="Times New Roman" w:hAnsi="Times New Roman"/>
-          <w:color w:val="000000"/>
-          <w:spacing w:val="-4"/>
-          <w:sz w:val="25"/>
-          <w:szCs w:val="25"/>
-        </w:rPr>
-        <w:t>định</w:t>
-      </w:r>
-      <w:proofErr w:type="spellEnd"/>
-      <w:r>
-        <w:rPr>
-          <w:rFonts w:ascii="Times New Roman" w:eastAsia="Times New Roman" w:hAnsi="Times New Roman"/>
-          <w:color w:val="000000"/>
-          <w:spacing w:val="-4"/>
-          <w:sz w:val="25"/>
-          <w:szCs w:val="25"/>
-        </w:rPr>
-        <w:t xml:space="preserve"> </w:t>
-      </w:r>
-      <w:proofErr w:type="spellStart"/>
-      <w:r>
-        <w:rPr>
-          <w:rFonts w:ascii="Times New Roman" w:eastAsia="Times New Roman" w:hAnsi="Times New Roman"/>
-          <w:color w:val="000000"/>
-          <w:spacing w:val="-4"/>
-          <w:sz w:val="25"/>
-          <w:szCs w:val="25"/>
-        </w:rPr>
-        <w:t>danh</w:t>
-      </w:r>
-      <w:proofErr w:type="spellEnd"/>
-      <w:r>
-        <w:rPr>
-          <w:rFonts w:ascii="Times New Roman" w:eastAsia="Times New Roman" w:hAnsi="Times New Roman"/>
-          <w:color w:val="000000"/>
-          <w:spacing w:val="-4"/>
-          <w:sz w:val="25"/>
-          <w:szCs w:val="25"/>
-        </w:rPr>
-        <w:t xml:space="preserve"> </w:t>
-      </w:r>
-      <w:proofErr w:type="spellStart"/>
-      <w:r>
-        <w:rPr>
-          <w:rFonts w:ascii="Times New Roman" w:eastAsia="Times New Roman" w:hAnsi="Times New Roman"/>
-          <w:color w:val="000000"/>
-          <w:spacing w:val="-4"/>
-          <w:sz w:val="25"/>
-          <w:szCs w:val="25"/>
-        </w:rPr>
-        <w:t>quốc</w:t>
-      </w:r>
-      <w:proofErr w:type="spellEnd"/>
-      <w:r>
-        <w:rPr>
-          <w:rFonts w:ascii="Times New Roman" w:eastAsia="Times New Roman" w:hAnsi="Times New Roman"/>
-          <w:color w:val="000000"/>
-          <w:spacing w:val="-4"/>
-          <w:sz w:val="25"/>
-          <w:szCs w:val="25"/>
-        </w:rPr>
-        <w:t xml:space="preserve"> </w:t>
-      </w:r>
-      <w:proofErr w:type="spellStart"/>
-      <w:r>
-        <w:rPr>
-          <w:rFonts w:ascii="Times New Roman" w:eastAsia="Times New Roman" w:hAnsi="Times New Roman"/>
-          <w:color w:val="000000"/>
-          <w:spacing w:val="-4"/>
-          <w:sz w:val="25"/>
-          <w:szCs w:val="25"/>
-        </w:rPr>
-        <w:t>gia</w:t>
-      </w:r>
-      <w:proofErr w:type="spellEnd"/>
-      <w:r>
-        <w:rPr>
-          <w:rFonts w:ascii="Times New Roman" w:eastAsia="Times New Roman" w:hAnsi="Times New Roman"/>
-          <w:color w:val="000000"/>
-          <w:spacing w:val="-10"/>
-          <w:sz w:val="25"/>
-          <w:szCs w:val="25"/>
-        </w:rPr>
-        <w:t xml:space="preserve"> </w:t>
-      </w:r>
-      <w:proofErr w:type="spellStart"/>
-      <w:r>
-        <w:rPr>
-          <w:rFonts w:ascii="Times New Roman" w:eastAsia="Times New Roman" w:hAnsi="Times New Roman"/>
-          <w:color w:val="000000"/>
-          <w:spacing w:val="-10"/>
-          <w:sz w:val="25"/>
-          <w:szCs w:val="25"/>
-        </w:rPr>
-        <w:t>thì</w:t>
-      </w:r>
-      <w:proofErr w:type="spellEnd"/>
-      <w:r>
-        <w:rPr>
-          <w:rFonts w:ascii="Times New Roman" w:eastAsia="Times New Roman" w:hAnsi="Times New Roman"/>
-          <w:color w:val="000000"/>
-          <w:spacing w:val="-10"/>
-          <w:sz w:val="25"/>
-          <w:szCs w:val="25"/>
-        </w:rPr>
-        <w:t xml:space="preserve"> </w:t>
-      </w:r>
-      <w:proofErr w:type="spellStart"/>
-      <w:r>
-        <w:rPr>
-          <w:rFonts w:ascii="Times New Roman" w:eastAsia="Times New Roman" w:hAnsi="Times New Roman"/>
-          <w:color w:val="000000"/>
-          <w:spacing w:val="-10"/>
-          <w:sz w:val="25"/>
-          <w:szCs w:val="25"/>
-        </w:rPr>
-        <w:t>người</w:t>
-      </w:r>
-      <w:proofErr w:type="spellEnd"/>
-      <w:r>
-        <w:rPr>
-          <w:rFonts w:ascii="Times New Roman" w:eastAsia="Times New Roman" w:hAnsi="Times New Roman"/>
-          <w:color w:val="000000"/>
-          <w:spacing w:val="-10"/>
-          <w:sz w:val="25"/>
-          <w:szCs w:val="25"/>
-        </w:rPr>
-        <w:t xml:space="preserve"> </w:t>
-      </w:r>
-      <w:proofErr w:type="spellStart"/>
-      <w:r>
-        <w:rPr>
-          <w:rFonts w:ascii="Times New Roman" w:eastAsia="Times New Roman" w:hAnsi="Times New Roman"/>
-          <w:color w:val="000000"/>
-          <w:spacing w:val="-10"/>
-          <w:sz w:val="25"/>
-          <w:szCs w:val="25"/>
-        </w:rPr>
-        <w:t>kê</w:t>
-      </w:r>
-      <w:proofErr w:type="spellEnd"/>
-      <w:r>
-        <w:rPr>
-          <w:rFonts w:ascii="Times New Roman" w:eastAsia="Times New Roman" w:hAnsi="Times New Roman"/>
-          <w:color w:val="000000"/>
-          <w:spacing w:val="-10"/>
-          <w:sz w:val="25"/>
-          <w:szCs w:val="25"/>
-        </w:rPr>
-        <w:t xml:space="preserve"> </w:t>
-      </w:r>
-      <w:proofErr w:type="spellStart"/>
-      <w:r>
-        <w:rPr>
-          <w:rFonts w:ascii="Times New Roman" w:eastAsia="Times New Roman" w:hAnsi="Times New Roman"/>
-          <w:color w:val="000000"/>
-          <w:spacing w:val="-10"/>
-          <w:sz w:val="25"/>
-          <w:szCs w:val="25"/>
-        </w:rPr>
-        <w:t>khai</w:t>
-      </w:r>
-      <w:proofErr w:type="spellEnd"/>
-      <w:r>
-        <w:rPr>
-          <w:rFonts w:ascii="Times New Roman" w:eastAsia="Times New Roman" w:hAnsi="Times New Roman"/>
-          <w:color w:val="000000"/>
-          <w:spacing w:val="-10"/>
-          <w:sz w:val="25"/>
-          <w:szCs w:val="25"/>
-        </w:rPr>
-        <w:t xml:space="preserve"> </w:t>
-      </w:r>
-      <w:proofErr w:type="spellStart"/>
-      <w:r>
-        <w:rPr>
-          <w:rFonts w:ascii="Times New Roman" w:eastAsia="Times New Roman" w:hAnsi="Times New Roman"/>
-          <w:color w:val="000000"/>
-          <w:spacing w:val="-10"/>
-          <w:sz w:val="25"/>
-          <w:szCs w:val="25"/>
-        </w:rPr>
-        <w:t>không</w:t>
-      </w:r>
-      <w:proofErr w:type="spellEnd"/>
-      <w:r>
-        <w:rPr>
-          <w:rFonts w:ascii="Times New Roman" w:eastAsia="Times New Roman" w:hAnsi="Times New Roman"/>
-          <w:color w:val="000000"/>
-          <w:spacing w:val="-10"/>
-          <w:sz w:val="25"/>
-          <w:szCs w:val="25"/>
-        </w:rPr>
-        <w:t xml:space="preserve"> </w:t>
-      </w:r>
-      <w:proofErr w:type="spellStart"/>
-      <w:r>
-        <w:rPr>
-          <w:rFonts w:ascii="Times New Roman" w:eastAsia="Times New Roman" w:hAnsi="Times New Roman"/>
-          <w:color w:val="000000"/>
-          <w:spacing w:val="-10"/>
-          <w:sz w:val="25"/>
-          <w:szCs w:val="25"/>
-        </w:rPr>
-        <w:t>phải</w:t>
-      </w:r>
-      <w:proofErr w:type="spellEnd"/>
-      <w:r>
-        <w:rPr>
-          <w:rFonts w:ascii="Times New Roman" w:eastAsia="Times New Roman" w:hAnsi="Times New Roman"/>
-          <w:color w:val="000000"/>
-          <w:spacing w:val="-10"/>
-          <w:sz w:val="25"/>
-          <w:szCs w:val="25"/>
-        </w:rPr>
-        <w:t xml:space="preserve"> </w:t>
-      </w:r>
-      <w:proofErr w:type="spellStart"/>
-      <w:r>
-        <w:rPr>
-          <w:rFonts w:ascii="Times New Roman" w:eastAsia="Times New Roman" w:hAnsi="Times New Roman"/>
-          <w:color w:val="000000"/>
-          <w:spacing w:val="-10"/>
-          <w:sz w:val="25"/>
-          <w:szCs w:val="25"/>
-        </w:rPr>
-        <w:t>ký</w:t>
-      </w:r>
-      <w:proofErr w:type="spellEnd"/>
-      <w:r>
-        <w:rPr>
-          <w:rFonts w:ascii="Times New Roman" w:eastAsia="Times New Roman" w:hAnsi="Times New Roman"/>
-          <w:color w:val="000000"/>
-          <w:spacing w:val="-10"/>
-          <w:sz w:val="25"/>
-          <w:szCs w:val="25"/>
-        </w:rPr>
-        <w:t xml:space="preserve"> </w:t>
-      </w:r>
-      <w:proofErr w:type="spellStart"/>
-      <w:r>
-        <w:rPr>
-          <w:rFonts w:ascii="Times New Roman" w:eastAsia="Times New Roman" w:hAnsi="Times New Roman"/>
-          <w:color w:val="000000"/>
-          <w:spacing w:val="-10"/>
-          <w:sz w:val="25"/>
-          <w:szCs w:val="25"/>
-        </w:rPr>
-        <w:t>vào</w:t>
-      </w:r>
-      <w:proofErr w:type="spellEnd"/>
-      <w:r>
-        <w:rPr>
-          <w:rFonts w:ascii="Times New Roman" w:eastAsia="Times New Roman" w:hAnsi="Times New Roman"/>
-          <w:color w:val="000000"/>
-          <w:spacing w:val="-10"/>
-          <w:sz w:val="25"/>
-          <w:szCs w:val="25"/>
-        </w:rPr>
-        <w:t xml:space="preserve"> </w:t>
-      </w:r>
-      <w:proofErr w:type="spellStart"/>
-      <w:r>
-        <w:rPr>
-          <w:rFonts w:ascii="Times New Roman" w:eastAsia="Times New Roman" w:hAnsi="Times New Roman"/>
-          <w:color w:val="000000"/>
-          <w:spacing w:val="-10"/>
-          <w:sz w:val="25"/>
-          <w:szCs w:val="25"/>
-        </w:rPr>
-        <w:t>mục</w:t>
-      </w:r>
-      <w:proofErr w:type="spellEnd"/>
-      <w:r>
-        <w:rPr>
-          <w:rFonts w:ascii="Times New Roman" w:eastAsia="Times New Roman" w:hAnsi="Times New Roman"/>
-          <w:color w:val="000000"/>
-          <w:spacing w:val="-10"/>
-          <w:sz w:val="25"/>
-          <w:szCs w:val="25"/>
-        </w:rPr>
-        <w:t xml:space="preserve"> </w:t>
-      </w:r>
-      <w:proofErr w:type="spellStart"/>
-      <w:r>
-        <w:rPr>
-          <w:rFonts w:ascii="Times New Roman" w:eastAsia="Times New Roman" w:hAnsi="Times New Roman"/>
-          <w:color w:val="000000"/>
-          <w:spacing w:val="-10"/>
-          <w:sz w:val="25"/>
-          <w:szCs w:val="25"/>
-        </w:rPr>
-        <w:t>này</w:t>
-      </w:r>
-      <w:proofErr w:type="spellEnd"/>
-      <w:r>
-        <w:rPr>
-          <w:rFonts w:ascii="Times New Roman" w:eastAsia="Times New Roman" w:hAnsi="Times New Roman"/>
-          <w:color w:val="000000"/>
-          <w:spacing w:val="-10"/>
-          <w:sz w:val="25"/>
-          <w:szCs w:val="25"/>
-          <w:lang w:val="vi-VN"/>
-        </w:rPr>
-        <w:t>.</w:t>
-      </w:r>
-      <w:r>
-        <w:rPr>
-          <w:rFonts w:ascii="Times New Roman" w:eastAsia="Times New Roman" w:hAnsi="Times New Roman"/>
-          <w:color w:val="000000"/>
-          <w:spacing w:val="-10"/>
-          <w:sz w:val="25"/>
-          <w:szCs w:val="25"/>
-        </w:rPr>
-        <w:t xml:space="preserve"> </w:t>
-      </w:r>
-      <w:r>
-        <w:rPr>
-          <w:rFonts w:ascii="Times New Roman" w:eastAsia="Times New Roman" w:hAnsi="Times New Roman"/>
-          <w:i/>
-          <w:color w:val="000000"/>
-          <w:spacing w:val="-10"/>
-          <w:sz w:val="25"/>
-          <w:szCs w:val="25"/>
-        </w:rPr>
-        <w:t xml:space="preserve">Trường </w:t>
-      </w:r>
-      <w:proofErr w:type="spellStart"/>
-      <w:r>
-        <w:rPr>
-          <w:rFonts w:ascii="Times New Roman" w:eastAsia="Times New Roman" w:hAnsi="Times New Roman"/>
-          <w:i/>
-          <w:color w:val="000000"/>
-          <w:spacing w:val="-10"/>
-          <w:sz w:val="25"/>
-          <w:szCs w:val="25"/>
-        </w:rPr>
-        <w:t>hợp</w:t>
-      </w:r>
-      <w:proofErr w:type="spellEnd"/>
-      <w:r>
-        <w:rPr>
-          <w:rFonts w:ascii="Times New Roman" w:eastAsia="Times New Roman" w:hAnsi="Times New Roman"/>
-          <w:i/>
-          <w:color w:val="000000"/>
-          <w:spacing w:val="-10"/>
-          <w:sz w:val="25"/>
-          <w:szCs w:val="25"/>
-        </w:rPr>
-        <w:t xml:space="preserve"> </w:t>
-      </w:r>
-      <w:proofErr w:type="spellStart"/>
-      <w:r>
-        <w:rPr>
-          <w:rFonts w:ascii="Times New Roman" w:eastAsia="Times New Roman" w:hAnsi="Times New Roman"/>
-          <w:i/>
-          <w:color w:val="000000"/>
-          <w:spacing w:val="-10"/>
-          <w:sz w:val="25"/>
-          <w:szCs w:val="25"/>
-        </w:rPr>
-        <w:t>người</w:t>
-      </w:r>
-      <w:proofErr w:type="spellEnd"/>
-      <w:r>
-        <w:rPr>
-          <w:rFonts w:ascii="Times New Roman" w:eastAsia="Times New Roman" w:hAnsi="Times New Roman"/>
-          <w:i/>
-          <w:color w:val="000000"/>
-          <w:spacing w:val="-10"/>
-          <w:sz w:val="25"/>
-          <w:szCs w:val="25"/>
-        </w:rPr>
-        <w:t xml:space="preserve"> </w:t>
-      </w:r>
-      <w:proofErr w:type="spellStart"/>
-      <w:r>
-        <w:rPr>
-          <w:rFonts w:ascii="Times New Roman" w:eastAsia="Times New Roman" w:hAnsi="Times New Roman"/>
-          <w:i/>
-          <w:color w:val="000000"/>
-          <w:spacing w:val="-10"/>
-          <w:sz w:val="25"/>
-          <w:szCs w:val="25"/>
-        </w:rPr>
-        <w:t>kê</w:t>
-      </w:r>
-      <w:proofErr w:type="spellEnd"/>
-      <w:r>
-        <w:rPr>
-          <w:rFonts w:ascii="Times New Roman" w:eastAsia="Times New Roman" w:hAnsi="Times New Roman"/>
-          <w:i/>
-          <w:color w:val="000000"/>
-          <w:spacing w:val="-10"/>
-          <w:sz w:val="25"/>
-          <w:szCs w:val="25"/>
-        </w:rPr>
-        <w:t xml:space="preserve"> </w:t>
-      </w:r>
-      <w:proofErr w:type="spellStart"/>
-      <w:r>
-        <w:rPr>
-          <w:rFonts w:ascii="Times New Roman" w:eastAsia="Times New Roman" w:hAnsi="Times New Roman"/>
-          <w:i/>
-          <w:color w:val="000000"/>
-          <w:spacing w:val="-10"/>
-          <w:sz w:val="25"/>
-          <w:szCs w:val="25"/>
-        </w:rPr>
-        <w:t>khai</w:t>
-      </w:r>
-      <w:proofErr w:type="spellEnd"/>
-      <w:r>
-        <w:rPr>
-          <w:rFonts w:ascii="Times New Roman" w:eastAsia="Times New Roman" w:hAnsi="Times New Roman"/>
-          <w:i/>
-          <w:color w:val="000000"/>
-          <w:spacing w:val="-10"/>
-          <w:sz w:val="25"/>
-          <w:szCs w:val="25"/>
-        </w:rPr>
-        <w:t xml:space="preserve"> </w:t>
-      </w:r>
-      <w:proofErr w:type="spellStart"/>
-      <w:r>
-        <w:rPr>
-          <w:rFonts w:ascii="Times New Roman" w:eastAsia="Times New Roman" w:hAnsi="Times New Roman"/>
-          <w:i/>
-          <w:color w:val="000000"/>
-          <w:spacing w:val="-10"/>
-          <w:sz w:val="25"/>
-          <w:szCs w:val="25"/>
-        </w:rPr>
-        <w:t>đồng</w:t>
-      </w:r>
-      <w:proofErr w:type="spellEnd"/>
-      <w:r>
-        <w:rPr>
-          <w:rFonts w:ascii="Times New Roman" w:eastAsia="Times New Roman" w:hAnsi="Times New Roman"/>
-          <w:i/>
-          <w:color w:val="000000"/>
-          <w:spacing w:val="-10"/>
-          <w:sz w:val="25"/>
-          <w:szCs w:val="25"/>
-        </w:rPr>
-        <w:t xml:space="preserve"> </w:t>
-      </w:r>
-      <w:proofErr w:type="spellStart"/>
-      <w:r>
-        <w:rPr>
-          <w:rFonts w:ascii="Times New Roman" w:eastAsia="Times New Roman" w:hAnsi="Times New Roman"/>
-          <w:i/>
-          <w:color w:val="000000"/>
-          <w:spacing w:val="-10"/>
-          <w:sz w:val="25"/>
-          <w:szCs w:val="25"/>
-        </w:rPr>
-        <w:t>thời</w:t>
-      </w:r>
-      <w:proofErr w:type="spellEnd"/>
-      <w:r>
-        <w:rPr>
-          <w:rFonts w:ascii="Times New Roman" w:eastAsia="Times New Roman" w:hAnsi="Times New Roman"/>
-          <w:i/>
-          <w:color w:val="000000"/>
-          <w:spacing w:val="-10"/>
-          <w:sz w:val="25"/>
-          <w:szCs w:val="25"/>
-        </w:rPr>
-        <w:t xml:space="preserve"> </w:t>
-      </w:r>
-      <w:proofErr w:type="spellStart"/>
-      <w:r>
-        <w:rPr>
-          <w:rFonts w:ascii="Times New Roman" w:eastAsia="Times New Roman" w:hAnsi="Times New Roman"/>
-          <w:i/>
-          <w:color w:val="000000"/>
-          <w:spacing w:val="-10"/>
-          <w:sz w:val="25"/>
-          <w:szCs w:val="25"/>
-        </w:rPr>
-        <w:t>là</w:t>
-      </w:r>
-      <w:proofErr w:type="spellEnd"/>
-      <w:r>
-        <w:rPr>
-          <w:rFonts w:ascii="Times New Roman" w:eastAsia="Times New Roman" w:hAnsi="Times New Roman"/>
-          <w:i/>
-          <w:color w:val="000000"/>
-          <w:spacing w:val="-10"/>
-          <w:sz w:val="25"/>
-          <w:szCs w:val="25"/>
-        </w:rPr>
-        <w:t xml:space="preserve"> </w:t>
-      </w:r>
-      <w:proofErr w:type="spellStart"/>
-      <w:r>
-        <w:rPr>
-          <w:rFonts w:ascii="Times New Roman" w:eastAsia="Times New Roman" w:hAnsi="Times New Roman"/>
-          <w:i/>
-          <w:color w:val="000000"/>
-          <w:spacing w:val="-10"/>
-          <w:sz w:val="25"/>
-          <w:szCs w:val="25"/>
-        </w:rPr>
-        <w:t>chủ</w:t>
-      </w:r>
-      <w:proofErr w:type="spellEnd"/>
-      <w:r>
-        <w:rPr>
-          <w:rFonts w:ascii="Times New Roman" w:eastAsia="Times New Roman" w:hAnsi="Times New Roman"/>
-          <w:i/>
-          <w:color w:val="000000"/>
-          <w:spacing w:val="-10"/>
-          <w:sz w:val="25"/>
-          <w:szCs w:val="25"/>
-        </w:rPr>
-        <w:t xml:space="preserve"> </w:t>
-      </w:r>
-      <w:proofErr w:type="spellStart"/>
-      <w:r>
-        <w:rPr>
-          <w:rFonts w:ascii="Times New Roman" w:eastAsia="Times New Roman" w:hAnsi="Times New Roman"/>
-          <w:i/>
-          <w:color w:val="000000"/>
-          <w:spacing w:val="-10"/>
-          <w:sz w:val="25"/>
-          <w:szCs w:val="25"/>
-        </w:rPr>
-        <w:t>hộ</w:t>
-      </w:r>
-      <w:proofErr w:type="spellEnd"/>
-      <w:r>
-        <w:rPr>
-          <w:rFonts w:ascii="Times New Roman" w:eastAsia="Times New Roman" w:hAnsi="Times New Roman"/>
-          <w:i/>
-          <w:color w:val="000000"/>
-          <w:spacing w:val="-10"/>
-          <w:sz w:val="25"/>
-          <w:szCs w:val="25"/>
-        </w:rPr>
-        <w:t xml:space="preserve"> </w:t>
-      </w:r>
-      <w:proofErr w:type="spellStart"/>
-      <w:r>
-        <w:rPr>
-          <w:rFonts w:ascii="Times New Roman" w:eastAsia="Times New Roman" w:hAnsi="Times New Roman"/>
-          <w:i/>
-          <w:color w:val="000000"/>
-          <w:spacing w:val="-10"/>
-          <w:sz w:val="25"/>
-          <w:szCs w:val="25"/>
-        </w:rPr>
-        <w:t>hoặc</w:t>
-      </w:r>
-      <w:proofErr w:type="spellEnd"/>
-      <w:r>
-        <w:rPr>
-          <w:rFonts w:ascii="Times New Roman" w:eastAsia="Times New Roman" w:hAnsi="Times New Roman"/>
-          <w:i/>
-          <w:color w:val="000000"/>
-          <w:spacing w:val="-10"/>
-          <w:sz w:val="25"/>
-          <w:szCs w:val="25"/>
-        </w:rPr>
-        <w:t xml:space="preserve"> </w:t>
-      </w:r>
-      <w:proofErr w:type="spellStart"/>
-      <w:r>
-        <w:rPr>
-          <w:rFonts w:ascii="Times New Roman" w:eastAsia="Times New Roman" w:hAnsi="Times New Roman"/>
-          <w:i/>
-          <w:color w:val="000000"/>
-          <w:spacing w:val="-10"/>
-          <w:sz w:val="25"/>
-          <w:szCs w:val="25"/>
-        </w:rPr>
-        <w:t>chủ</w:t>
-      </w:r>
-      <w:proofErr w:type="spellEnd"/>
-      <w:r>
-        <w:rPr>
-          <w:rFonts w:ascii="Times New Roman" w:eastAsia="Times New Roman" w:hAnsi="Times New Roman"/>
-          <w:i/>
-          <w:color w:val="000000"/>
-          <w:spacing w:val="-10"/>
-          <w:sz w:val="25"/>
-          <w:szCs w:val="25"/>
-        </w:rPr>
-        <w:t xml:space="preserve"> </w:t>
-      </w:r>
-      <w:proofErr w:type="spellStart"/>
-      <w:r>
-        <w:rPr>
-          <w:rFonts w:ascii="Times New Roman" w:eastAsia="Times New Roman" w:hAnsi="Times New Roman"/>
-          <w:i/>
-          <w:color w:val="000000"/>
-          <w:spacing w:val="-10"/>
-          <w:sz w:val="25"/>
-          <w:szCs w:val="25"/>
-        </w:rPr>
-        <w:t>sở</w:t>
-      </w:r>
-      <w:proofErr w:type="spellEnd"/>
-      <w:r>
-        <w:rPr>
-          <w:rFonts w:ascii="Times New Roman" w:eastAsia="Times New Roman" w:hAnsi="Times New Roman"/>
-          <w:i/>
-          <w:color w:val="000000"/>
-          <w:spacing w:val="-10"/>
-          <w:sz w:val="25"/>
-          <w:szCs w:val="25"/>
-        </w:rPr>
-        <w:t xml:space="preserve"> </w:t>
-      </w:r>
-      <w:proofErr w:type="spellStart"/>
-      <w:r>
-        <w:rPr>
-          <w:rFonts w:ascii="Times New Roman" w:eastAsia="Times New Roman" w:hAnsi="Times New Roman"/>
-          <w:i/>
-          <w:color w:val="000000"/>
-          <w:spacing w:val="-10"/>
-          <w:sz w:val="25"/>
-          <w:szCs w:val="25"/>
-        </w:rPr>
-        <w:t>hữu</w:t>
-      </w:r>
-      <w:proofErr w:type="spellEnd"/>
-      <w:r>
-        <w:rPr>
-          <w:rFonts w:ascii="Times New Roman" w:eastAsia="Times New Roman" w:hAnsi="Times New Roman"/>
-          <w:i/>
-          <w:color w:val="000000"/>
-          <w:spacing w:val="-10"/>
-          <w:sz w:val="25"/>
-          <w:szCs w:val="25"/>
-        </w:rPr>
-        <w:t xml:space="preserve"> </w:t>
-      </w:r>
-      <w:proofErr w:type="spellStart"/>
-      <w:r>
-        <w:rPr>
-          <w:rFonts w:ascii="Times New Roman" w:eastAsia="Times New Roman" w:hAnsi="Times New Roman"/>
-          <w:i/>
-          <w:color w:val="000000"/>
-          <w:spacing w:val="-10"/>
-          <w:sz w:val="25"/>
-          <w:szCs w:val="25"/>
-        </w:rPr>
-        <w:t>chỗ</w:t>
-      </w:r>
-      <w:proofErr w:type="spellEnd"/>
-      <w:r>
-        <w:rPr>
-          <w:rFonts w:ascii="Times New Roman" w:eastAsia="Times New Roman" w:hAnsi="Times New Roman"/>
-          <w:i/>
-          <w:color w:val="000000"/>
-          <w:spacing w:val="-10"/>
-          <w:sz w:val="25"/>
-          <w:szCs w:val="25"/>
-        </w:rPr>
-        <w:t xml:space="preserve"> ở </w:t>
-      </w:r>
-      <w:proofErr w:type="spellStart"/>
-      <w:r>
-        <w:rPr>
-          <w:rFonts w:ascii="Times New Roman" w:eastAsia="Times New Roman" w:hAnsi="Times New Roman"/>
-          <w:i/>
-          <w:color w:val="000000"/>
-          <w:spacing w:val="-10"/>
-          <w:sz w:val="25"/>
-          <w:szCs w:val="25"/>
-        </w:rPr>
-        <w:t>hợp</w:t>
-      </w:r>
-      <w:proofErr w:type="spellEnd"/>
-      <w:r>
-        <w:rPr>
-          <w:rFonts w:ascii="Times New Roman" w:eastAsia="Times New Roman" w:hAnsi="Times New Roman"/>
-          <w:i/>
-          <w:color w:val="000000"/>
-          <w:spacing w:val="-10"/>
-          <w:sz w:val="25"/>
-          <w:szCs w:val="25"/>
-        </w:rPr>
-        <w:t xml:space="preserve"> </w:t>
-      </w:r>
-      <w:proofErr w:type="spellStart"/>
-      <w:r>
-        <w:rPr>
-          <w:rFonts w:ascii="Times New Roman" w:eastAsia="Times New Roman" w:hAnsi="Times New Roman"/>
-          <w:i/>
-          <w:color w:val="000000"/>
-          <w:spacing w:val="-10"/>
-          <w:sz w:val="25"/>
-          <w:szCs w:val="25"/>
-        </w:rPr>
-        <w:t>pháp</w:t>
-      </w:r>
-      <w:proofErr w:type="spellEnd"/>
-      <w:r>
-        <w:rPr>
-          <w:rFonts w:ascii="Times New Roman" w:eastAsia="Times New Roman" w:hAnsi="Times New Roman"/>
-          <w:i/>
-          <w:color w:val="000000"/>
-          <w:spacing w:val="-10"/>
-          <w:sz w:val="25"/>
-          <w:szCs w:val="25"/>
-        </w:rPr>
-        <w:t xml:space="preserve"> </w:t>
-      </w:r>
-      <w:proofErr w:type="spellStart"/>
-      <w:r>
-        <w:rPr>
-          <w:rFonts w:ascii="Times New Roman" w:eastAsia="Times New Roman" w:hAnsi="Times New Roman"/>
-          <w:i/>
-          <w:color w:val="000000"/>
-          <w:spacing w:val="-10"/>
-          <w:sz w:val="25"/>
-          <w:szCs w:val="25"/>
-        </w:rPr>
-        <w:t>hoặc</w:t>
-      </w:r>
-      <w:proofErr w:type="spellEnd"/>
-      <w:r>
-        <w:rPr>
-          <w:rFonts w:ascii="Times New Roman" w:eastAsia="Times New Roman" w:hAnsi="Times New Roman"/>
-          <w:i/>
-          <w:color w:val="000000"/>
-          <w:spacing w:val="-10"/>
-          <w:sz w:val="25"/>
-          <w:szCs w:val="25"/>
-        </w:rPr>
-        <w:t xml:space="preserve"> cha, </w:t>
-      </w:r>
-      <w:proofErr w:type="spellStart"/>
-      <w:r>
-        <w:rPr>
-          <w:rFonts w:ascii="Times New Roman" w:eastAsia="Times New Roman" w:hAnsi="Times New Roman"/>
-          <w:i/>
-          <w:color w:val="000000"/>
-          <w:spacing w:val="-10"/>
-          <w:sz w:val="25"/>
-          <w:szCs w:val="25"/>
-        </w:rPr>
-        <w:t>mẹ</w:t>
-      </w:r>
-      <w:proofErr w:type="spellEnd"/>
-      <w:r>
-        <w:rPr>
-          <w:rFonts w:ascii="Times New Roman" w:eastAsia="Times New Roman" w:hAnsi="Times New Roman"/>
-          <w:i/>
-          <w:color w:val="000000"/>
-          <w:spacing w:val="-10"/>
-          <w:sz w:val="25"/>
-          <w:szCs w:val="25"/>
-        </w:rPr>
-        <w:t xml:space="preserve">, </w:t>
-      </w:r>
-      <w:proofErr w:type="spellStart"/>
-      <w:r>
-        <w:rPr>
-          <w:rFonts w:ascii="Times New Roman" w:eastAsia="Times New Roman" w:hAnsi="Times New Roman"/>
-          <w:i/>
-          <w:color w:val="000000"/>
-          <w:spacing w:val="-10"/>
-          <w:sz w:val="25"/>
-          <w:szCs w:val="25"/>
-        </w:rPr>
-        <w:t>người</w:t>
-      </w:r>
-      <w:proofErr w:type="spellEnd"/>
-      <w:r>
-        <w:rPr>
-          <w:rFonts w:ascii="Times New Roman" w:eastAsia="Times New Roman" w:hAnsi="Times New Roman"/>
-          <w:i/>
-          <w:color w:val="000000"/>
-          <w:spacing w:val="-10"/>
-          <w:sz w:val="25"/>
-          <w:szCs w:val="25"/>
-        </w:rPr>
-        <w:t xml:space="preserve"> </w:t>
-      </w:r>
-      <w:proofErr w:type="spellStart"/>
-      <w:r>
-        <w:rPr>
-          <w:rFonts w:ascii="Times New Roman" w:eastAsia="Times New Roman" w:hAnsi="Times New Roman"/>
-          <w:i/>
-          <w:color w:val="000000"/>
-          <w:spacing w:val="-10"/>
-          <w:sz w:val="25"/>
-          <w:szCs w:val="25"/>
-        </w:rPr>
-        <w:t>giám</w:t>
-      </w:r>
-      <w:proofErr w:type="spellEnd"/>
-      <w:r>
-        <w:rPr>
-          <w:rFonts w:ascii="Times New Roman" w:eastAsia="Times New Roman" w:hAnsi="Times New Roman"/>
-          <w:i/>
-          <w:color w:val="000000"/>
-          <w:spacing w:val="-10"/>
-          <w:sz w:val="25"/>
-          <w:szCs w:val="25"/>
-        </w:rPr>
-        <w:t xml:space="preserve"> </w:t>
-      </w:r>
-      <w:proofErr w:type="spellStart"/>
-      <w:r>
-        <w:rPr>
-          <w:rFonts w:ascii="Times New Roman" w:eastAsia="Times New Roman" w:hAnsi="Times New Roman"/>
-          <w:i/>
-          <w:color w:val="000000"/>
-          <w:spacing w:val="-10"/>
-          <w:sz w:val="25"/>
-          <w:szCs w:val="25"/>
-        </w:rPr>
-        <w:t>hộ</w:t>
-      </w:r>
-      <w:proofErr w:type="spellEnd"/>
-      <w:r>
-        <w:rPr>
-          <w:rFonts w:ascii="Times New Roman" w:eastAsia="Times New Roman" w:hAnsi="Times New Roman"/>
-          <w:i/>
-          <w:color w:val="000000"/>
-          <w:spacing w:val="-10"/>
-          <w:sz w:val="25"/>
-          <w:szCs w:val="25"/>
-        </w:rPr>
-        <w:t xml:space="preserve"> </w:t>
-      </w:r>
-      <w:proofErr w:type="spellStart"/>
-      <w:r>
-        <w:rPr>
-          <w:rFonts w:ascii="Times New Roman" w:eastAsia="Times New Roman" w:hAnsi="Times New Roman"/>
-          <w:i/>
-          <w:color w:val="000000"/>
-          <w:spacing w:val="-10"/>
-          <w:sz w:val="25"/>
-          <w:szCs w:val="25"/>
-        </w:rPr>
-        <w:t>của</w:t>
-      </w:r>
-      <w:proofErr w:type="spellEnd"/>
-      <w:r>
-        <w:rPr>
-          <w:rFonts w:ascii="Times New Roman" w:eastAsia="Times New Roman" w:hAnsi="Times New Roman"/>
-          <w:i/>
-          <w:color w:val="000000"/>
-          <w:spacing w:val="-10"/>
-          <w:sz w:val="25"/>
-          <w:szCs w:val="25"/>
-        </w:rPr>
-        <w:t xml:space="preserve"> </w:t>
-      </w:r>
-      <w:proofErr w:type="spellStart"/>
-      <w:r>
-        <w:rPr>
-          <w:rFonts w:ascii="Times New Roman" w:eastAsia="Times New Roman" w:hAnsi="Times New Roman"/>
-          <w:i/>
-          <w:color w:val="000000"/>
-          <w:spacing w:val="-10"/>
-          <w:sz w:val="25"/>
-          <w:szCs w:val="25"/>
-        </w:rPr>
-        <w:t>người</w:t>
-      </w:r>
-      <w:proofErr w:type="spellEnd"/>
-      <w:r>
-        <w:rPr>
-          <w:rFonts w:ascii="Times New Roman" w:eastAsia="Times New Roman" w:hAnsi="Times New Roman"/>
-          <w:i/>
-          <w:color w:val="000000"/>
-          <w:spacing w:val="-10"/>
-          <w:sz w:val="25"/>
-          <w:szCs w:val="25"/>
-        </w:rPr>
-        <w:t xml:space="preserve"> </w:t>
-      </w:r>
-      <w:proofErr w:type="spellStart"/>
-      <w:r>
-        <w:rPr>
-          <w:rFonts w:ascii="Times New Roman" w:eastAsia="Times New Roman" w:hAnsi="Times New Roman"/>
-          <w:i/>
-          <w:color w:val="000000"/>
-          <w:spacing w:val="-10"/>
-          <w:sz w:val="25"/>
-          <w:szCs w:val="25"/>
-        </w:rPr>
-        <w:t>thay</w:t>
-      </w:r>
-      <w:proofErr w:type="spellEnd"/>
-      <w:r>
-        <w:rPr>
-          <w:rFonts w:ascii="Times New Roman" w:eastAsia="Times New Roman" w:hAnsi="Times New Roman"/>
-          <w:i/>
-          <w:color w:val="000000"/>
-          <w:spacing w:val="-10"/>
-          <w:sz w:val="25"/>
-          <w:szCs w:val="25"/>
-        </w:rPr>
-        <w:t xml:space="preserve"> </w:t>
-      </w:r>
-      <w:proofErr w:type="spellStart"/>
-      <w:r>
-        <w:rPr>
-          <w:rFonts w:ascii="Times New Roman" w:eastAsia="Times New Roman" w:hAnsi="Times New Roman"/>
-          <w:i/>
-          <w:color w:val="000000"/>
-          <w:spacing w:val="-10"/>
-          <w:sz w:val="25"/>
-          <w:szCs w:val="25"/>
-        </w:rPr>
-        <w:t>đổi</w:t>
-      </w:r>
-      <w:proofErr w:type="spellEnd"/>
-      <w:r>
-        <w:rPr>
-          <w:rFonts w:ascii="Times New Roman" w:eastAsia="Times New Roman" w:hAnsi="Times New Roman"/>
-          <w:i/>
-          <w:color w:val="000000"/>
-          <w:spacing w:val="-10"/>
-          <w:sz w:val="25"/>
-          <w:szCs w:val="25"/>
-        </w:rPr>
-        <w:t xml:space="preserve"> </w:t>
-      </w:r>
-      <w:proofErr w:type="spellStart"/>
-      <w:r>
-        <w:rPr>
-          <w:rFonts w:ascii="Times New Roman" w:eastAsia="Times New Roman" w:hAnsi="Times New Roman"/>
-          <w:i/>
-          <w:color w:val="000000"/>
-          <w:spacing w:val="-10"/>
-          <w:sz w:val="25"/>
-          <w:szCs w:val="25"/>
-        </w:rPr>
-        <w:t>thì</w:t>
-      </w:r>
-      <w:proofErr w:type="spellEnd"/>
-      <w:r>
-        <w:rPr>
-          <w:rFonts w:ascii="Times New Roman" w:eastAsia="Times New Roman" w:hAnsi="Times New Roman"/>
-          <w:i/>
-          <w:color w:val="000000"/>
-          <w:spacing w:val="-10"/>
-          <w:sz w:val="25"/>
-          <w:szCs w:val="25"/>
-        </w:rPr>
-        <w:t xml:space="preserve"> </w:t>
-      </w:r>
-      <w:proofErr w:type="spellStart"/>
-      <w:r>
-        <w:rPr>
-          <w:rFonts w:ascii="Times New Roman" w:eastAsia="Times New Roman" w:hAnsi="Times New Roman"/>
-          <w:i/>
-          <w:color w:val="000000"/>
-          <w:spacing w:val="-10"/>
-          <w:sz w:val="25"/>
-          <w:szCs w:val="25"/>
-        </w:rPr>
-        <w:t>người</w:t>
-      </w:r>
-      <w:proofErr w:type="spellEnd"/>
-      <w:r>
-        <w:rPr>
-          <w:rFonts w:ascii="Times New Roman" w:eastAsia="Times New Roman" w:hAnsi="Times New Roman"/>
-          <w:i/>
-          <w:color w:val="000000"/>
-          <w:spacing w:val="-10"/>
-          <w:sz w:val="25"/>
-          <w:szCs w:val="25"/>
-        </w:rPr>
-        <w:t xml:space="preserve"> </w:t>
-      </w:r>
-      <w:proofErr w:type="spellStart"/>
-      <w:r>
-        <w:rPr>
-          <w:rFonts w:ascii="Times New Roman" w:eastAsia="Times New Roman" w:hAnsi="Times New Roman"/>
-          <w:i/>
-          <w:color w:val="000000"/>
-          <w:spacing w:val="-10"/>
-          <w:sz w:val="25"/>
-          <w:szCs w:val="25"/>
-        </w:rPr>
-        <w:t>kê</w:t>
-      </w:r>
-      <w:proofErr w:type="spellEnd"/>
-      <w:r>
-        <w:rPr>
-          <w:rFonts w:ascii="Times New Roman" w:eastAsia="Times New Roman" w:hAnsi="Times New Roman"/>
-          <w:i/>
-          <w:color w:val="000000"/>
-          <w:spacing w:val="-10"/>
-          <w:sz w:val="25"/>
-          <w:szCs w:val="25"/>
-        </w:rPr>
-        <w:t xml:space="preserve"> </w:t>
-      </w:r>
-      <w:proofErr w:type="spellStart"/>
-      <w:r>
-        <w:rPr>
-          <w:rFonts w:ascii="Times New Roman" w:eastAsia="Times New Roman" w:hAnsi="Times New Roman"/>
-          <w:i/>
-          <w:color w:val="000000"/>
-          <w:spacing w:val="-10"/>
-          <w:sz w:val="25"/>
-          <w:szCs w:val="25"/>
-        </w:rPr>
-        <w:t>khai</w:t>
-      </w:r>
-      <w:proofErr w:type="spellEnd"/>
-      <w:r>
-        <w:rPr>
-          <w:rFonts w:ascii="Times New Roman" w:eastAsia="Times New Roman" w:hAnsi="Times New Roman"/>
-          <w:i/>
-          <w:color w:val="000000"/>
-          <w:spacing w:val="-10"/>
-          <w:sz w:val="25"/>
-          <w:szCs w:val="25"/>
-        </w:rPr>
-        <w:t xml:space="preserve"> </w:t>
-      </w:r>
-      <w:proofErr w:type="spellStart"/>
-      <w:r>
-        <w:rPr>
-          <w:rFonts w:ascii="Times New Roman" w:eastAsia="Times New Roman" w:hAnsi="Times New Roman"/>
-          <w:i/>
-          <w:color w:val="000000"/>
-          <w:spacing w:val="-10"/>
-          <w:sz w:val="25"/>
-          <w:szCs w:val="25"/>
-        </w:rPr>
-        <w:t>không</w:t>
-      </w:r>
-      <w:proofErr w:type="spellEnd"/>
-      <w:r>
-        <w:rPr>
-          <w:rFonts w:ascii="Times New Roman" w:eastAsia="Times New Roman" w:hAnsi="Times New Roman"/>
-          <w:i/>
-          <w:color w:val="000000"/>
-          <w:spacing w:val="-10"/>
-          <w:sz w:val="25"/>
-          <w:szCs w:val="25"/>
-        </w:rPr>
-        <w:t xml:space="preserve"> </w:t>
-      </w:r>
-      <w:proofErr w:type="spellStart"/>
-      <w:r>
-        <w:rPr>
-          <w:rFonts w:ascii="Times New Roman" w:eastAsia="Times New Roman" w:hAnsi="Times New Roman"/>
-          <w:i/>
-          <w:color w:val="000000"/>
-          <w:spacing w:val="-10"/>
-          <w:sz w:val="25"/>
-          <w:szCs w:val="25"/>
-        </w:rPr>
-        <w:t>phải</w:t>
-      </w:r>
-      <w:proofErr w:type="spellEnd"/>
-      <w:r>
-        <w:rPr>
-          <w:rFonts w:ascii="Times New Roman" w:eastAsia="Times New Roman" w:hAnsi="Times New Roman"/>
-          <w:i/>
-          <w:color w:val="000000"/>
-          <w:spacing w:val="-10"/>
-          <w:sz w:val="25"/>
-          <w:szCs w:val="25"/>
-        </w:rPr>
-        <w:t xml:space="preserve"> </w:t>
-      </w:r>
-      <w:proofErr w:type="spellStart"/>
-      <w:r>
-        <w:rPr>
-          <w:rFonts w:ascii="Times New Roman" w:eastAsia="Times New Roman" w:hAnsi="Times New Roman"/>
-          <w:i/>
-          <w:color w:val="000000"/>
-          <w:spacing w:val="-10"/>
-          <w:sz w:val="25"/>
-          <w:szCs w:val="25"/>
-        </w:rPr>
-        <w:t>ký</w:t>
-      </w:r>
-      <w:proofErr w:type="spellEnd"/>
-      <w:r>
-        <w:rPr>
-          <w:rFonts w:ascii="Times New Roman" w:eastAsia="Times New Roman" w:hAnsi="Times New Roman"/>
-          <w:i/>
-          <w:color w:val="000000"/>
-          <w:spacing w:val="-10"/>
-          <w:sz w:val="25"/>
-          <w:szCs w:val="25"/>
-        </w:rPr>
-        <w:t xml:space="preserve"> </w:t>
-      </w:r>
-      <w:proofErr w:type="spellStart"/>
-      <w:r>
-        <w:rPr>
-          <w:rFonts w:ascii="Times New Roman" w:eastAsia="Times New Roman" w:hAnsi="Times New Roman"/>
-          <w:i/>
-          <w:color w:val="000000"/>
-          <w:spacing w:val="-10"/>
-          <w:sz w:val="25"/>
-          <w:szCs w:val="25"/>
-        </w:rPr>
-        <w:t>vào</w:t>
-      </w:r>
-      <w:proofErr w:type="spellEnd"/>
-      <w:r>
-        <w:rPr>
-          <w:rFonts w:ascii="Times New Roman" w:eastAsia="Times New Roman" w:hAnsi="Times New Roman"/>
-          <w:i/>
-          <w:color w:val="000000"/>
-          <w:spacing w:val="-10"/>
-          <w:sz w:val="25"/>
-          <w:szCs w:val="25"/>
-        </w:rPr>
-        <w:t xml:space="preserve"> </w:t>
-      </w:r>
-      <w:proofErr w:type="spellStart"/>
-      <w:r>
-        <w:rPr>
-          <w:rFonts w:ascii="Times New Roman" w:eastAsia="Times New Roman" w:hAnsi="Times New Roman"/>
-          <w:i/>
-          <w:color w:val="000000"/>
-          <w:spacing w:val="-10"/>
-          <w:sz w:val="25"/>
-          <w:szCs w:val="25"/>
-        </w:rPr>
-        <w:t>các</w:t>
-      </w:r>
-      <w:proofErr w:type="spellEnd"/>
-      <w:r>
-        <w:rPr>
-          <w:rFonts w:ascii="Times New Roman" w:eastAsia="Times New Roman" w:hAnsi="Times New Roman"/>
-          <w:i/>
-          <w:color w:val="000000"/>
-          <w:spacing w:val="-10"/>
-          <w:sz w:val="25"/>
-          <w:szCs w:val="25"/>
-        </w:rPr>
-        <w:t xml:space="preserve"> </w:t>
-      </w:r>
-      <w:proofErr w:type="spellStart"/>
-      <w:r>
-        <w:rPr>
-          <w:rFonts w:ascii="Times New Roman" w:eastAsia="Times New Roman" w:hAnsi="Times New Roman"/>
-          <w:i/>
-          <w:color w:val="000000"/>
-          <w:spacing w:val="-10"/>
-          <w:sz w:val="25"/>
-          <w:szCs w:val="25"/>
-        </w:rPr>
-        <w:t>mục</w:t>
-      </w:r>
-      <w:proofErr w:type="spellEnd"/>
-      <w:r>
-        <w:rPr>
-          <w:rFonts w:ascii="Times New Roman" w:eastAsia="Times New Roman" w:hAnsi="Times New Roman"/>
-          <w:i/>
-          <w:color w:val="000000"/>
-          <w:spacing w:val="-10"/>
-          <w:sz w:val="25"/>
-          <w:szCs w:val="25"/>
-        </w:rPr>
-        <w:t xml:space="preserve"> (3), (4), (5), (6).</w:t>
+        <w:t>Trường hợp người kê khai đồng thời là chủ hộ hoặc chủ sở hữu chỗ ở hợp pháp hoặc cha, mẹ, người giám hộ của người thay đổi thì người kê khai không phải ký vào các mục (3), (4), (5), (6).</w:t>
       </w:r>
     </w:p>
     <w:p>
@@ -8439,7 +5127,6 @@
         </w:rPr>
         <w:t xml:space="preserve">xác nhận nội dung đồng ý thông qua ứng dụng </w:t>
       </w:r>
-      <w:proofErr w:type="spellStart"/>
       <w:r>
         <w:rPr>
           <w:rFonts w:ascii="Times New Roman" w:eastAsia="Times New Roman" w:hAnsi="Times New Roman"/>
@@ -8448,75 +5135,8 @@
           <w:sz w:val="25"/>
           <w:szCs w:val="25"/>
         </w:rPr>
-        <w:t>định</w:t>
-      </w:r>
-      <w:proofErr w:type="spellEnd"/>
-      <w:r>
-        <w:rPr>
-          <w:rFonts w:ascii="Times New Roman" w:eastAsia="Times New Roman" w:hAnsi="Times New Roman"/>
-          <w:color w:val="000000"/>
-          <w:spacing w:val="-4"/>
-          <w:sz w:val="25"/>
-          <w:szCs w:val="25"/>
-        </w:rPr>
-        <w:t xml:space="preserve"> </w:t>
-      </w:r>
-      <w:proofErr w:type="spellStart"/>
-      <w:r>
-        <w:rPr>
-          <w:rFonts w:ascii="Times New Roman" w:eastAsia="Times New Roman" w:hAnsi="Times New Roman"/>
-          <w:color w:val="000000"/>
-          <w:spacing w:val="-4"/>
-          <w:sz w:val="25"/>
-          <w:szCs w:val="25"/>
-        </w:rPr>
-        <w:t>danh</w:t>
-      </w:r>
-      <w:proofErr w:type="spellEnd"/>
-      <w:r>
-        <w:rPr>
-          <w:rFonts w:ascii="Times New Roman" w:eastAsia="Times New Roman" w:hAnsi="Times New Roman"/>
-          <w:color w:val="000000"/>
-          <w:spacing w:val="-4"/>
-          <w:sz w:val="25"/>
-          <w:szCs w:val="25"/>
-        </w:rPr>
-        <w:t xml:space="preserve"> </w:t>
-      </w:r>
-      <w:proofErr w:type="spellStart"/>
-      <w:r>
-        <w:rPr>
-          <w:rFonts w:ascii="Times New Roman" w:eastAsia="Times New Roman" w:hAnsi="Times New Roman"/>
-          <w:color w:val="000000"/>
-          <w:spacing w:val="-4"/>
-          <w:sz w:val="25"/>
-          <w:szCs w:val="25"/>
-        </w:rPr>
-        <w:t>quốc</w:t>
-      </w:r>
-      <w:proofErr w:type="spellEnd"/>
-      <w:r>
-        <w:rPr>
-          <w:rFonts w:ascii="Times New Roman" w:eastAsia="Times New Roman" w:hAnsi="Times New Roman"/>
-          <w:color w:val="000000"/>
-          <w:spacing w:val="-4"/>
-          <w:sz w:val="25"/>
-          <w:szCs w:val="25"/>
-        </w:rPr>
-        <w:t xml:space="preserve"> </w:t>
-      </w:r>
-      <w:proofErr w:type="spellStart"/>
-      <w:r>
-        <w:rPr>
-          <w:rFonts w:ascii="Times New Roman" w:eastAsia="Times New Roman" w:hAnsi="Times New Roman"/>
-          <w:color w:val="000000"/>
-          <w:spacing w:val="-4"/>
-          <w:sz w:val="25"/>
-          <w:szCs w:val="25"/>
-        </w:rPr>
-        <w:t>gia</w:t>
-      </w:r>
-      <w:proofErr w:type="spellEnd"/>
+        <w:t>định danh quốc gia</w:t>
+      </w:r>
       <w:r>
         <w:rPr>
           <w:rFonts w:ascii="Times New Roman" w:eastAsia="Times New Roman" w:hAnsi="Times New Roman"/>
@@ -9596,7 +6216,7 @@
   <w:docParts>
     <w:docPart>
       <w:docPartPr>
-        <w:name w:val="69C72379540142E5B4B2E0A15C08DF03"/>
+        <w:name w:val="548483FE28C94D9AB9078CBD2189CEEB"/>
         <w:category>
           <w:name w:val="General"/>
           <w:gallery w:val="placeholder"/>
@@ -9607,12 +6227,12 @@
         <w:behaviors>
           <w:behavior w:val="content"/>
         </w:behaviors>
-        <w:guid w:val="{B944BA60-E9A2-4598-96D2-B3802A812682}"/>
+        <w:guid w:val="{83AA8B65-F383-4578-9C72-88C81DF4179C}"/>
       </w:docPartPr>
       <w:docPartBody>
         <w:p>
           <w:pPr>
-            <w:pStyle w:val="69C72379540142E5B4B2E0A15C08DF03"/>
+            <w:pStyle w:val="548483FE28C94D9AB9078CBD2189CEEB"/>
           </w:pPr>
           <w:r>
             <w:rPr>
@@ -9625,7 +6245,7 @@
     </w:docPart>
     <w:docPart>
       <w:docPartPr>
-        <w:name w:val="C4464C7239DB436787CDA0A4E69DF63B"/>
+        <w:name w:val="016B758F79FC4EC9809C0F34ECBB3D7B"/>
         <w:category>
           <w:name w:val="General"/>
           <w:gallery w:val="placeholder"/>
@@ -9636,12 +6256,12 @@
         <w:behaviors>
           <w:behavior w:val="content"/>
         </w:behaviors>
-        <w:guid w:val="{B7F55070-EFEC-4291-8C64-1EEE324F730C}"/>
+        <w:guid w:val="{424B1484-3084-4726-834F-BEFA330FE14E}"/>
       </w:docPartPr>
       <w:docPartBody>
         <w:p>
           <w:pPr>
-            <w:pStyle w:val="C4464C7239DB436787CDA0A4E69DF63B"/>
+            <w:pStyle w:val="016B758F79FC4EC9809C0F34ECBB3D7B"/>
           </w:pPr>
           <w:r>
             <w:rPr>
@@ -9741,6 +6361,13 @@
     <w:rsid w:val="0007522F"/>
     <w:rsid w:val="00110171"/>
     <w:rsid w:val="0030558B"/>
+    <w:rsid w:val="00413B12"/>
+    <w:rsid w:val="004E4FA4"/>
+    <w:rsid w:val="00567248"/>
+    <w:rsid w:val="005B7B82"/>
+    <w:rsid w:val="009527AF"/>
+    <w:rsid w:val="00B40072"/>
+    <w:rsid w:val="00BF0832"/>
     <w:rsid w:val="00CA4951"/>
     <w:rsid w:val="00E24F31"/>
     <w:rsid w:val="00F55FCA"/>
@@ -10199,7 +6826,7 @@
     <w:basedOn w:val="DefaultParagraphFont"/>
     <w:uiPriority w:val="99"/>
     <w:semiHidden/>
-    <w:rsid w:val="0030558B"/>
+    <w:rsid w:val="005B7B82"/>
     <w:rPr>
       <w:color w:val="666666"/>
     </w:rPr>
@@ -10211,6 +6838,14 @@
   <w:style w:type="paragraph" w:customStyle="1" w:styleId="C4464C7239DB436787CDA0A4E69DF63B">
     <w:name w:val="C4464C7239DB436787CDA0A4E69DF63B"/>
     <w:rsid w:val="0030558B"/>
+  </w:style>
+  <w:style w:type="paragraph" w:customStyle="1" w:styleId="548483FE28C94D9AB9078CBD2189CEEB">
+    <w:name w:val="548483FE28C94D9AB9078CBD2189CEEB"/>
+    <w:rsid w:val="005B7B82"/>
+  </w:style>
+  <w:style w:type="paragraph" w:customStyle="1" w:styleId="016B758F79FC4EC9809C0F34ECBB3D7B">
+    <w:name w:val="016B758F79FC4EC9809C0F34ECBB3D7B"/>
+    <w:rsid w:val="005B7B82"/>
   </w:style>
 </w:styles>
 </file>
@@ -10538,12 +7173,9 @@
 </file>
 
 <file path=customXml/item1.xml><?xml version="1.0" encoding="utf-8"?>
-<?mso-contentType ?>
-<FormTemplates xmlns="http://schemas.microsoft.com/sharepoint/v3/contenttype/forms">
-  <Display>DocumentLibraryForm</Display>
-  <Edit>DocumentLibraryForm</Edit>
-  <New>DocumentLibraryForm</New>
-</FormTemplates>
+<p:properties xmlns:p="http://schemas.microsoft.com/office/2006/metadata/properties" xmlns:xsi="http://www.w3.org/2001/XMLSchema-instance" xmlns:pc="http://schemas.microsoft.com/office/infopath/2007/PartnerControls">
+  <documentManagement/>
+</p:properties>
 </file>
 
 <file path=customXml/item2.xml><?xml version="1.0" encoding="utf-8"?>
@@ -10661,15 +7293,19 @@
 </file>
 
 <file path=customXml/item3.xml><?xml version="1.0" encoding="utf-8"?>
-<p:properties xmlns:p="http://schemas.microsoft.com/office/2006/metadata/properties" xmlns:xsi="http://www.w3.org/2001/XMLSchema-instance" xmlns:pc="http://schemas.microsoft.com/office/infopath/2007/PartnerControls">
-  <documentManagement/>
-</p:properties>
+<?mso-contentType ?>
+<FormTemplates xmlns="http://schemas.microsoft.com/sharepoint/v3/contenttype/forms">
+  <Display>DocumentLibraryForm</Display>
+  <Edit>DocumentLibraryForm</Edit>
+  <New>DocumentLibraryForm</New>
+</FormTemplates>
 </file>
 
 <file path=customXml/itemProps1.xml><?xml version="1.0" encoding="utf-8"?>
-<ds:datastoreItem xmlns:ds="http://schemas.openxmlformats.org/officeDocument/2006/customXml" ds:itemID="{DF1C0F5B-8A4A-47B4-A2DB-4BEBD756A28D}">
+<ds:datastoreItem xmlns:ds="http://schemas.openxmlformats.org/officeDocument/2006/customXml" ds:itemID="{69A31FD1-E98A-4960-A215-3E7BFD613630}">
   <ds:schemaRefs>
-    <ds:schemaRef ds:uri="http://schemas.microsoft.com/sharepoint/v3/contenttype/forms"/>
+    <ds:schemaRef ds:uri="http://schemas.microsoft.com/office/2006/metadata/properties"/>
+    <ds:schemaRef ds:uri="http://schemas.microsoft.com/office/infopath/2007/PartnerControls"/>
   </ds:schemaRefs>
 </ds:datastoreItem>
 </file>
@@ -10691,10 +7327,9 @@
 </file>
 
 <file path=customXml/itemProps3.xml><?xml version="1.0" encoding="utf-8"?>
-<ds:datastoreItem xmlns:ds="http://schemas.openxmlformats.org/officeDocument/2006/customXml" ds:itemID="{69A31FD1-E98A-4960-A215-3E7BFD613630}">
+<ds:datastoreItem xmlns:ds="http://schemas.openxmlformats.org/officeDocument/2006/customXml" ds:itemID="{DF1C0F5B-8A4A-47B4-A2DB-4BEBD756A28D}">
   <ds:schemaRefs>
-    <ds:schemaRef ds:uri="http://schemas.microsoft.com/office/2006/metadata/properties"/>
-    <ds:schemaRef ds:uri="http://schemas.microsoft.com/office/infopath/2007/PartnerControls"/>
+    <ds:schemaRef ds:uri="http://schemas.microsoft.com/sharepoint/v3/contenttype/forms"/>
   </ds:schemaRefs>
 </ds:datastoreItem>
 </file>
</xml_diff>